<commit_message>
fix: update Excercise Slot 1
</commit_message>
<xml_diff>
--- a/SLOT 1/DE190556_VuDucGiang_Excersice1.docx
+++ b/SLOT 1/DE190556_VuDucGiang_Excersice1.docx
@@ -156,7 +156,7 @@
           <w:kern w:val="0"/>
           <w:sz w:val="24"/>
           <w:szCs w:val="24"/>
-          <w:lang w:eastAsia="vi-VN"/>
+          <w:lang w:val="en-US" w:eastAsia="vi-VN"/>
           <w14:ligatures w14:val="none"/>
         </w:rPr>
       </w:pPr>
@@ -202,7 +202,7 @@
     </w:p>
     <w:p>
       <w:pPr>
-        <w:spacing w:after="120" w:line="240" w:lineRule="auto"/>
+        <w:spacing w:after="0" w:line="240" w:lineRule="auto"/>
         <w:rPr>
           <w:rFonts w:asciiTheme="majorHAnsi" w:eastAsia="Times New Roman" w:hAnsiTheme="majorHAnsi" w:cstheme="majorHAnsi"/>
           <w:color w:val="1F1F1F"/>
@@ -210,23 +210,6 @@
           <w:sz w:val="24"/>
           <w:szCs w:val="24"/>
           <w:lang w:val="en-US" w:eastAsia="vi-VN"/>
-          <w14:ligatures w14:val="none"/>
-        </w:rPr>
-      </w:pPr>
-    </w:p>
-    <w:p>
-      <w:pPr>
-        <w:spacing w:after="120" w:line="240" w:lineRule="auto"/>
-        <w:outlineLvl w:val="1"/>
-        <w:rPr>
-          <w:rFonts w:asciiTheme="majorHAnsi" w:eastAsia="Times New Roman" w:hAnsiTheme="majorHAnsi" w:cstheme="majorHAnsi"/>
-          <w:b/>
-          <w:bCs/>
-          <w:color w:val="1F1F1F"/>
-          <w:kern w:val="0"/>
-          <w:sz w:val="24"/>
-          <w:szCs w:val="24"/>
-          <w:lang w:eastAsia="vi-VN"/>
           <w14:ligatures w14:val="none"/>
         </w:rPr>
       </w:pPr>
@@ -370,7 +353,7 @@
           <w:kern w:val="0"/>
           <w:sz w:val="24"/>
           <w:szCs w:val="24"/>
-          <w:lang w:eastAsia="vi-VN"/>
+          <w:lang w:val="en-US" w:eastAsia="vi-VN"/>
           <w14:ligatures w14:val="none"/>
         </w:rPr>
       </w:pPr>
@@ -389,26 +372,9 @@
     </w:p>
     <w:p>
       <w:pPr>
-        <w:spacing w:after="120" w:line="240" w:lineRule="auto"/>
-        <w:rPr>
-          <w:rFonts w:asciiTheme="majorHAnsi" w:eastAsia="Times New Roman" w:hAnsiTheme="majorHAnsi" w:cstheme="majorHAnsi"/>
-          <w:color w:val="1F1F1F"/>
-          <w:kern w:val="0"/>
-          <w:sz w:val="24"/>
-          <w:szCs w:val="24"/>
-          <w:lang w:eastAsia="vi-VN"/>
-          <w14:ligatures w14:val="none"/>
-        </w:rPr>
-      </w:pPr>
-    </w:p>
-    <w:p>
-      <w:pPr>
-        <w:spacing w:after="120" w:line="240" w:lineRule="auto"/>
-        <w:outlineLvl w:val="1"/>
-        <w:rPr>
-          <w:rFonts w:asciiTheme="majorHAnsi" w:eastAsia="Times New Roman" w:hAnsiTheme="majorHAnsi" w:cstheme="majorHAnsi"/>
-          <w:b/>
-          <w:bCs/>
+        <w:spacing w:after="150" w:line="240" w:lineRule="auto"/>
+        <w:rPr>
+          <w:rFonts w:asciiTheme="majorHAnsi" w:eastAsia="Times New Roman" w:hAnsiTheme="majorHAnsi" w:cstheme="majorHAnsi"/>
           <w:color w:val="1F1F1F"/>
           <w:kern w:val="0"/>
           <w:sz w:val="24"/>
@@ -792,7 +758,8 @@
     </w:p>
     <w:p>
       <w:pPr>
-        <w:spacing w:after="120" w:line="240" w:lineRule="auto"/>
+        <w:spacing w:after="0" w:line="240" w:lineRule="auto"/>
+        <w:ind w:left="720"/>
         <w:rPr>
           <w:rFonts w:asciiTheme="majorHAnsi" w:eastAsia="Times New Roman" w:hAnsiTheme="majorHAnsi" w:cstheme="majorHAnsi"/>
           <w:color w:val="1F1F1F"/>
@@ -830,38 +797,6 @@
           <w:lang w:eastAsia="vi-VN"/>
           <w14:ligatures w14:val="none"/>
         </w:rPr>
-        <w:br w:type="page"/>
-      </w:r>
-    </w:p>
-    <w:p>
-      <w:pPr>
-        <w:spacing w:after="120" w:line="240" w:lineRule="auto"/>
-        <w:outlineLvl w:val="1"/>
-        <w:rPr>
-          <w:rFonts w:asciiTheme="majorHAnsi" w:eastAsia="Times New Roman" w:hAnsiTheme="majorHAnsi" w:cstheme="majorHAnsi"/>
-          <w:b/>
-          <w:bCs/>
-          <w:color w:val="1F1F1F"/>
-          <w:kern w:val="0"/>
-          <w:sz w:val="24"/>
-          <w:szCs w:val="24"/>
-          <w:lang w:eastAsia="vi-VN"/>
-          <w14:ligatures w14:val="none"/>
-        </w:rPr>
-      </w:pPr>
-      <w:r>
-        <w:rPr>
-          <w:rFonts w:asciiTheme="majorHAnsi" w:eastAsia="Times New Roman" w:hAnsiTheme="majorHAnsi" w:cstheme="majorHAnsi"/>
-          <w:b/>
-          <w:bCs/>
-          <w:color w:val="1F1F1F"/>
-          <w:kern w:val="0"/>
-          <w:sz w:val="24"/>
-          <w:szCs w:val="24"/>
-          <w:lang w:eastAsia="vi-VN"/>
-          <w14:ligatures w14:val="none"/>
-        </w:rPr>
-        <w:lastRenderedPageBreak/>
         <w:t>3. Lợi ích của việc sử dụng ORM/JPA</w:t>
       </w:r>
     </w:p>
@@ -1222,32 +1157,45 @@
     </w:p>
     <w:p>
       <w:pPr>
-        <w:spacing w:after="120" w:line="240" w:lineRule="auto"/>
-        <w:outlineLvl w:val="1"/>
-        <w:rPr>
-          <w:rFonts w:asciiTheme="majorHAnsi" w:eastAsia="Times New Roman" w:hAnsiTheme="majorHAnsi" w:cstheme="majorHAnsi"/>
-          <w:b/>
-          <w:bCs/>
-          <w:color w:val="1F1F1F"/>
-          <w:kern w:val="0"/>
-          <w:sz w:val="24"/>
-          <w:szCs w:val="24"/>
-          <w:lang w:eastAsia="vi-VN"/>
-          <w14:ligatures w14:val="none"/>
-        </w:rPr>
-      </w:pPr>
-      <w:r>
-        <w:rPr>
-          <w:rFonts w:asciiTheme="majorHAnsi" w:eastAsia="Times New Roman" w:hAnsiTheme="majorHAnsi" w:cstheme="majorHAnsi"/>
-          <w:b/>
-          <w:bCs/>
-          <w:color w:val="1F1F1F"/>
-          <w:kern w:val="0"/>
-          <w:sz w:val="24"/>
-          <w:szCs w:val="24"/>
-          <w:lang w:eastAsia="vi-VN"/>
-          <w14:ligatures w14:val="none"/>
-        </w:rPr>
+        <w:rPr>
+          <w:rFonts w:asciiTheme="majorHAnsi" w:eastAsia="Times New Roman" w:hAnsiTheme="majorHAnsi" w:cstheme="majorHAnsi"/>
+          <w:b/>
+          <w:bCs/>
+          <w:color w:val="1F1F1F"/>
+          <w:kern w:val="0"/>
+          <w:sz w:val="24"/>
+          <w:szCs w:val="24"/>
+          <w:lang w:eastAsia="vi-VN"/>
+          <w14:ligatures w14:val="none"/>
+        </w:rPr>
+      </w:pPr>
+      <w:r>
+        <w:rPr>
+          <w:rFonts w:asciiTheme="majorHAnsi" w:eastAsia="Times New Roman" w:hAnsiTheme="majorHAnsi" w:cstheme="majorHAnsi"/>
+          <w:b/>
+          <w:bCs/>
+          <w:color w:val="1F1F1F"/>
+          <w:kern w:val="0"/>
+          <w:sz w:val="24"/>
+          <w:szCs w:val="24"/>
+          <w:lang w:eastAsia="vi-VN"/>
+          <w14:ligatures w14:val="none"/>
+        </w:rPr>
+        <w:br w:type="page"/>
+      </w:r>
+      <w:r>
+        <w:rPr>
+          <w:rFonts w:asciiTheme="majorHAnsi" w:eastAsia="Times New Roman" w:hAnsiTheme="majorHAnsi" w:cstheme="majorHAnsi"/>
+          <w:b/>
+          <w:bCs/>
+          <w:color w:val="1F1F1F"/>
+          <w:kern w:val="0"/>
+          <w:sz w:val="24"/>
+          <w:szCs w:val="24"/>
+          <w:lang w:eastAsia="vi-VN"/>
+          <w14:ligatures w14:val="none"/>
+        </w:rPr>
+        <w:lastRenderedPageBreak/>
         <w:t>4. Ví dụ minh họa</w:t>
       </w:r>
     </w:p>
@@ -1437,33 +1385,6 @@
     </w:p>
     <w:p>
       <w:pPr>
-        <w:spacing w:after="0" w:line="240" w:lineRule="auto"/>
-        <w:rPr>
-          <w:rFonts w:asciiTheme="majorHAnsi" w:eastAsia="Times New Roman" w:hAnsiTheme="majorHAnsi" w:cstheme="majorHAnsi"/>
-          <w:color w:val="444746"/>
-          <w:kern w:val="0"/>
-          <w:sz w:val="24"/>
-          <w:szCs w:val="24"/>
-          <w:lang w:eastAsia="vi-VN"/>
-          <w14:ligatures w14:val="none"/>
-        </w:rPr>
-      </w:pPr>
-      <w:r>
-        <w:rPr>
-          <w:rFonts w:asciiTheme="majorHAnsi" w:eastAsia="Times New Roman" w:hAnsiTheme="majorHAnsi" w:cstheme="majorHAnsi"/>
-          <w:color w:val="444746"/>
-          <w:kern w:val="0"/>
-          <w:sz w:val="24"/>
-          <w:szCs w:val="24"/>
-          <w:bdr w:val="none" w:sz="0" w:space="0" w:color="auto" w:frame="1"/>
-          <w:lang w:eastAsia="vi-VN"/>
-          <w14:ligatures w14:val="none"/>
-        </w:rPr>
-        <w:t>Java</w:t>
-      </w:r>
-    </w:p>
-    <w:p>
-      <w:pPr>
         <w:pStyle w:val="NormalWeb"/>
         <w:pBdr>
           <w:top w:val="single" w:sz="6" w:space="2" w:color="888888"/>
@@ -1662,6 +1583,1206 @@
     </w:p>
     <w:p>
       <w:pPr>
+        <w:spacing w:after="120" w:line="240" w:lineRule="auto"/>
+        <w:outlineLvl w:val="1"/>
+        <w:rPr>
+          <w:rFonts w:asciiTheme="majorHAnsi" w:eastAsia="Times New Roman" w:hAnsiTheme="majorHAnsi" w:cstheme="majorHAnsi"/>
+          <w:b/>
+          <w:bCs/>
+          <w:color w:val="1F1F1F"/>
+          <w:kern w:val="0"/>
+          <w:sz w:val="24"/>
+          <w:szCs w:val="24"/>
+          <w:lang w:eastAsia="vi-VN"/>
+          <w14:ligatures w14:val="none"/>
+        </w:rPr>
+      </w:pPr>
+      <w:r>
+        <w:rPr>
+          <w:rFonts w:asciiTheme="majorHAnsi" w:eastAsia="Times New Roman" w:hAnsiTheme="majorHAnsi" w:cstheme="majorHAnsi"/>
+          <w:b/>
+          <w:bCs/>
+          <w:color w:val="1F1F1F"/>
+          <w:kern w:val="0"/>
+          <w:sz w:val="24"/>
+          <w:szCs w:val="24"/>
+          <w:lang w:eastAsia="vi-VN"/>
+          <w14:ligatures w14:val="none"/>
+        </w:rPr>
+        <w:t>5. Mối quan hệ giữa JPA và Hibernate</w:t>
+      </w:r>
+    </w:p>
+    <w:p>
+      <w:pPr>
+        <w:spacing w:after="150" w:line="240" w:lineRule="auto"/>
+        <w:rPr>
+          <w:rFonts w:asciiTheme="majorHAnsi" w:eastAsia="Times New Roman" w:hAnsiTheme="majorHAnsi" w:cstheme="majorHAnsi"/>
+          <w:color w:val="1F1F1F"/>
+          <w:kern w:val="0"/>
+          <w:sz w:val="24"/>
+          <w:szCs w:val="24"/>
+          <w:lang w:eastAsia="vi-VN"/>
+          <w14:ligatures w14:val="none"/>
+        </w:rPr>
+      </w:pPr>
+      <w:r>
+        <w:rPr>
+          <w:rFonts w:asciiTheme="majorHAnsi" w:eastAsia="Times New Roman" w:hAnsiTheme="majorHAnsi" w:cstheme="majorHAnsi"/>
+          <w:color w:val="1F1F1F"/>
+          <w:kern w:val="0"/>
+          <w:sz w:val="24"/>
+          <w:szCs w:val="24"/>
+          <w:lang w:eastAsia="vi-VN"/>
+          <w14:ligatures w14:val="none"/>
+        </w:rPr>
+        <w:t>Một nhầm lẫn phổ biến là coi JPA và Hibernate là một. Thực tế:</w:t>
+      </w:r>
+    </w:p>
+    <w:p>
+      <w:pPr>
+        <w:numPr>
+          <w:ilvl w:val="0"/>
+          <w:numId w:val="7"/>
+        </w:numPr>
+        <w:spacing w:after="0" w:line="240" w:lineRule="auto"/>
+        <w:rPr>
+          <w:rFonts w:asciiTheme="majorHAnsi" w:eastAsia="Times New Roman" w:hAnsiTheme="majorHAnsi" w:cstheme="majorHAnsi"/>
+          <w:color w:val="1F1F1F"/>
+          <w:kern w:val="0"/>
+          <w:sz w:val="24"/>
+          <w:szCs w:val="24"/>
+          <w:lang w:eastAsia="vi-VN"/>
+          <w14:ligatures w14:val="none"/>
+        </w:rPr>
+      </w:pPr>
+      <w:r>
+        <w:rPr>
+          <w:rFonts w:asciiTheme="majorHAnsi" w:eastAsia="Times New Roman" w:hAnsiTheme="majorHAnsi" w:cstheme="majorHAnsi"/>
+          <w:b/>
+          <w:bCs/>
+          <w:color w:val="1F1F1F"/>
+          <w:kern w:val="0"/>
+          <w:sz w:val="24"/>
+          <w:szCs w:val="24"/>
+          <w:bdr w:val="none" w:sz="0" w:space="0" w:color="auto" w:frame="1"/>
+          <w:lang w:eastAsia="vi-VN"/>
+          <w14:ligatures w14:val="none"/>
+        </w:rPr>
+        <w:t>JPA</w:t>
+      </w:r>
+      <w:r>
+        <w:rPr>
+          <w:rFonts w:asciiTheme="majorHAnsi" w:eastAsia="Times New Roman" w:hAnsiTheme="majorHAnsi" w:cstheme="majorHAnsi"/>
+          <w:color w:val="1F1F1F"/>
+          <w:kern w:val="0"/>
+          <w:sz w:val="24"/>
+          <w:szCs w:val="24"/>
+          <w:lang w:eastAsia="vi-VN"/>
+          <w14:ligatures w14:val="none"/>
+        </w:rPr>
+        <w:t xml:space="preserve"> là </w:t>
+      </w:r>
+      <w:r>
+        <w:rPr>
+          <w:rFonts w:asciiTheme="majorHAnsi" w:eastAsia="Times New Roman" w:hAnsiTheme="majorHAnsi" w:cstheme="majorHAnsi"/>
+          <w:b/>
+          <w:bCs/>
+          <w:color w:val="1F1F1F"/>
+          <w:kern w:val="0"/>
+          <w:sz w:val="24"/>
+          <w:szCs w:val="24"/>
+          <w:bdr w:val="none" w:sz="0" w:space="0" w:color="auto" w:frame="1"/>
+          <w:lang w:eastAsia="vi-VN"/>
+          <w14:ligatures w14:val="none"/>
+        </w:rPr>
+        <w:t>giao diện/tiêu chuẩn</w:t>
+      </w:r>
+      <w:r>
+        <w:rPr>
+          <w:rFonts w:asciiTheme="majorHAnsi" w:eastAsia="Times New Roman" w:hAnsiTheme="majorHAnsi" w:cstheme="majorHAnsi"/>
+          <w:color w:val="1F1F1F"/>
+          <w:kern w:val="0"/>
+          <w:sz w:val="24"/>
+          <w:szCs w:val="24"/>
+          <w:lang w:eastAsia="vi-VN"/>
+          <w14:ligatures w14:val="none"/>
+        </w:rPr>
+        <w:t>: Nó đưa ra các quy tắc và hướng dẫn (như một bản thiết kế).</w:t>
+      </w:r>
+    </w:p>
+    <w:p>
+      <w:pPr>
+        <w:numPr>
+          <w:ilvl w:val="0"/>
+          <w:numId w:val="7"/>
+        </w:numPr>
+        <w:spacing w:after="0" w:line="240" w:lineRule="auto"/>
+        <w:rPr>
+          <w:rFonts w:asciiTheme="majorHAnsi" w:eastAsia="Times New Roman" w:hAnsiTheme="majorHAnsi" w:cstheme="majorHAnsi"/>
+          <w:color w:val="1F1F1F"/>
+          <w:kern w:val="0"/>
+          <w:sz w:val="24"/>
+          <w:szCs w:val="24"/>
+          <w:lang w:eastAsia="vi-VN"/>
+          <w14:ligatures w14:val="none"/>
+        </w:rPr>
+      </w:pPr>
+      <w:r>
+        <w:rPr>
+          <w:rFonts w:asciiTheme="majorHAnsi" w:eastAsia="Times New Roman" w:hAnsiTheme="majorHAnsi" w:cstheme="majorHAnsi"/>
+          <w:b/>
+          <w:bCs/>
+          <w:color w:val="1F1F1F"/>
+          <w:kern w:val="0"/>
+          <w:sz w:val="24"/>
+          <w:szCs w:val="24"/>
+          <w:bdr w:val="none" w:sz="0" w:space="0" w:color="auto" w:frame="1"/>
+          <w:lang w:eastAsia="vi-VN"/>
+          <w14:ligatures w14:val="none"/>
+        </w:rPr>
+        <w:t>Hibernate</w:t>
+      </w:r>
+      <w:r>
+        <w:rPr>
+          <w:rFonts w:asciiTheme="majorHAnsi" w:eastAsia="Times New Roman" w:hAnsiTheme="majorHAnsi" w:cstheme="majorHAnsi"/>
+          <w:color w:val="1F1F1F"/>
+          <w:kern w:val="0"/>
+          <w:sz w:val="24"/>
+          <w:szCs w:val="24"/>
+          <w:lang w:eastAsia="vi-VN"/>
+          <w14:ligatures w14:val="none"/>
+        </w:rPr>
+        <w:t xml:space="preserve"> là </w:t>
+      </w:r>
+      <w:r>
+        <w:rPr>
+          <w:rFonts w:asciiTheme="majorHAnsi" w:eastAsia="Times New Roman" w:hAnsiTheme="majorHAnsi" w:cstheme="majorHAnsi"/>
+          <w:b/>
+          <w:bCs/>
+          <w:color w:val="1F1F1F"/>
+          <w:kern w:val="0"/>
+          <w:sz w:val="24"/>
+          <w:szCs w:val="24"/>
+          <w:bdr w:val="none" w:sz="0" w:space="0" w:color="auto" w:frame="1"/>
+          <w:lang w:eastAsia="vi-VN"/>
+          <w14:ligatures w14:val="none"/>
+        </w:rPr>
+        <w:t>triển khai (Implementation)</w:t>
+      </w:r>
+      <w:r>
+        <w:rPr>
+          <w:rFonts w:asciiTheme="majorHAnsi" w:eastAsia="Times New Roman" w:hAnsiTheme="majorHAnsi" w:cstheme="majorHAnsi"/>
+          <w:color w:val="1F1F1F"/>
+          <w:kern w:val="0"/>
+          <w:sz w:val="24"/>
+          <w:szCs w:val="24"/>
+          <w:lang w:eastAsia="vi-VN"/>
+          <w14:ligatures w14:val="none"/>
+        </w:rPr>
+        <w:t>: Nó là thư viện cụ thể thực hiện các quy tắc mà JPA đề ra. Bạn có thể hiểu JPA là giao diện điều khiển, còn Hibernate là động cơ bên dưới.</w:t>
+      </w:r>
+    </w:p>
+    <w:p>
+      <w:pPr>
+        <w:rPr>
+          <w:rFonts w:asciiTheme="majorHAnsi" w:hAnsiTheme="majorHAnsi" w:cstheme="majorHAnsi"/>
+          <w:b/>
+          <w:bCs/>
+          <w:sz w:val="24"/>
+          <w:szCs w:val="24"/>
+          <w:lang w:val="en-US"/>
+        </w:rPr>
+      </w:pPr>
+      <w:r>
+        <w:rPr>
+          <w:rFonts w:asciiTheme="majorHAnsi" w:hAnsiTheme="majorHAnsi" w:cstheme="majorHAnsi"/>
+          <w:b/>
+          <w:bCs/>
+          <w:sz w:val="24"/>
+          <w:szCs w:val="24"/>
+          <w:lang w:val="en-US"/>
+        </w:rPr>
+        <w:br/>
+      </w:r>
+      <w:r>
+        <w:rPr>
+          <w:rFonts w:asciiTheme="majorHAnsi" w:hAnsiTheme="majorHAnsi" w:cstheme="majorHAnsi"/>
+          <w:b/>
+          <w:bCs/>
+          <w:sz w:val="24"/>
+          <w:szCs w:val="24"/>
+          <w:lang w:val="en-US"/>
+        </w:rPr>
+        <w:t xml:space="preserve">Spring Framework </w:t>
+      </w:r>
+      <w:proofErr w:type="spellStart"/>
+      <w:r>
+        <w:rPr>
+          <w:rFonts w:asciiTheme="majorHAnsi" w:hAnsiTheme="majorHAnsi" w:cstheme="majorHAnsi"/>
+          <w:b/>
+          <w:bCs/>
+          <w:sz w:val="24"/>
+          <w:szCs w:val="24"/>
+          <w:lang w:val="en-US"/>
+        </w:rPr>
+        <w:t>là</w:t>
+      </w:r>
+      <w:proofErr w:type="spellEnd"/>
+      <w:r>
+        <w:rPr>
+          <w:rFonts w:asciiTheme="majorHAnsi" w:hAnsiTheme="majorHAnsi" w:cstheme="majorHAnsi"/>
+          <w:b/>
+          <w:bCs/>
+          <w:sz w:val="24"/>
+          <w:szCs w:val="24"/>
+          <w:lang w:val="en-US"/>
+        </w:rPr>
+        <w:t xml:space="preserve"> </w:t>
+      </w:r>
+      <w:proofErr w:type="spellStart"/>
+      <w:proofErr w:type="gramStart"/>
+      <w:r>
+        <w:rPr>
+          <w:rFonts w:asciiTheme="majorHAnsi" w:hAnsiTheme="majorHAnsi" w:cstheme="majorHAnsi"/>
+          <w:b/>
+          <w:bCs/>
+          <w:sz w:val="24"/>
+          <w:szCs w:val="24"/>
+          <w:lang w:val="en-US"/>
+        </w:rPr>
+        <w:t>gì</w:t>
+      </w:r>
+      <w:proofErr w:type="spellEnd"/>
+      <w:r>
+        <w:rPr>
+          <w:rFonts w:asciiTheme="majorHAnsi" w:hAnsiTheme="majorHAnsi" w:cstheme="majorHAnsi"/>
+          <w:b/>
+          <w:bCs/>
+          <w:sz w:val="24"/>
+          <w:szCs w:val="24"/>
+          <w:lang w:val="en-US"/>
+        </w:rPr>
+        <w:t xml:space="preserve"> ?</w:t>
+      </w:r>
+      <w:proofErr w:type="gramEnd"/>
+      <w:r>
+        <w:rPr>
+          <w:rFonts w:asciiTheme="majorHAnsi" w:hAnsiTheme="majorHAnsi" w:cstheme="majorHAnsi"/>
+          <w:b/>
+          <w:bCs/>
+          <w:sz w:val="24"/>
+          <w:szCs w:val="24"/>
+          <w:lang w:val="en-US"/>
+        </w:rPr>
+        <w:t xml:space="preserve"> </w:t>
+      </w:r>
+      <w:r>
+        <w:rPr>
+          <w:rFonts w:asciiTheme="majorHAnsi" w:hAnsiTheme="majorHAnsi" w:cstheme="majorHAnsi"/>
+          <w:b/>
+          <w:bCs/>
+          <w:sz w:val="24"/>
+          <w:szCs w:val="24"/>
+          <w:lang w:val="en-US"/>
+        </w:rPr>
+        <w:br/>
+      </w:r>
+      <w:r>
+        <w:rPr>
+          <w:rFonts w:asciiTheme="majorHAnsi" w:eastAsia="Times New Roman" w:hAnsiTheme="majorHAnsi" w:cstheme="majorHAnsi"/>
+          <w:b/>
+          <w:bCs/>
+          <w:kern w:val="0"/>
+          <w:sz w:val="24"/>
+          <w:szCs w:val="24"/>
+          <w:lang w:eastAsia="vi-VN"/>
+          <w14:ligatures w14:val="none"/>
+        </w:rPr>
+        <w:t>Spring Framework</w:t>
+      </w:r>
+      <w:r>
+        <w:rPr>
+          <w:rFonts w:asciiTheme="majorHAnsi" w:eastAsia="Times New Roman" w:hAnsiTheme="majorHAnsi" w:cstheme="majorHAnsi"/>
+          <w:kern w:val="0"/>
+          <w:sz w:val="24"/>
+          <w:szCs w:val="24"/>
+          <w:lang w:eastAsia="vi-VN"/>
+          <w14:ligatures w14:val="none"/>
+        </w:rPr>
+        <w:t xml:space="preserve"> là một hệ sinh thái (framework) mã nguồn mở cực kỳ phổ biến để phát triển các ứng dụng Java Enterprise. Nó cung cấp một hạ tầng toàn diện giúp lập trình viên giải quyết các vấn đề phức tạp trong phát triển phần mềm, từ việc quản lý các đối tượng đến kết nối cơ sở dữ liệu và bảo mật.</w:t>
+      </w:r>
+    </w:p>
+    <w:p>
+      <w:pPr>
+        <w:spacing w:before="100" w:beforeAutospacing="1" w:after="100" w:afterAutospacing="1" w:line="240" w:lineRule="auto"/>
+        <w:rPr>
+          <w:rFonts w:asciiTheme="majorHAnsi" w:eastAsia="Times New Roman" w:hAnsiTheme="majorHAnsi" w:cstheme="majorHAnsi"/>
+          <w:kern w:val="0"/>
+          <w:sz w:val="24"/>
+          <w:szCs w:val="24"/>
+          <w:lang w:eastAsia="vi-VN"/>
+          <w14:ligatures w14:val="none"/>
+        </w:rPr>
+      </w:pPr>
+      <w:r>
+        <w:rPr>
+          <w:rFonts w:asciiTheme="majorHAnsi" w:eastAsia="Times New Roman" w:hAnsiTheme="majorHAnsi" w:cstheme="majorHAnsi"/>
+          <w:kern w:val="0"/>
+          <w:sz w:val="24"/>
+          <w:szCs w:val="24"/>
+          <w:lang w:eastAsia="vi-VN"/>
+          <w14:ligatures w14:val="none"/>
+        </w:rPr>
+        <w:t>Hai khái niệm cốt lõi tạo nên sức mạnh của Spring là:</w:t>
+      </w:r>
+    </w:p>
+    <w:p>
+      <w:pPr>
+        <w:numPr>
+          <w:ilvl w:val="0"/>
+          <w:numId w:val="8"/>
+        </w:numPr>
+        <w:spacing w:before="100" w:beforeAutospacing="1" w:after="100" w:afterAutospacing="1" w:line="240" w:lineRule="auto"/>
+        <w:rPr>
+          <w:rFonts w:asciiTheme="majorHAnsi" w:eastAsia="Times New Roman" w:hAnsiTheme="majorHAnsi" w:cstheme="majorHAnsi"/>
+          <w:kern w:val="0"/>
+          <w:sz w:val="24"/>
+          <w:szCs w:val="24"/>
+          <w:lang w:eastAsia="vi-VN"/>
+          <w14:ligatures w14:val="none"/>
+        </w:rPr>
+      </w:pPr>
+      <w:r>
+        <w:rPr>
+          <w:rFonts w:asciiTheme="majorHAnsi" w:eastAsia="Times New Roman" w:hAnsiTheme="majorHAnsi" w:cstheme="majorHAnsi"/>
+          <w:b/>
+          <w:bCs/>
+          <w:kern w:val="0"/>
+          <w:sz w:val="24"/>
+          <w:szCs w:val="24"/>
+          <w:lang w:eastAsia="vi-VN"/>
+          <w14:ligatures w14:val="none"/>
+        </w:rPr>
+        <w:t>Inversion of Control (IoC):</w:t>
+      </w:r>
+      <w:r>
+        <w:rPr>
+          <w:rFonts w:asciiTheme="majorHAnsi" w:eastAsia="Times New Roman" w:hAnsiTheme="majorHAnsi" w:cstheme="majorHAnsi"/>
+          <w:kern w:val="0"/>
+          <w:sz w:val="24"/>
+          <w:szCs w:val="24"/>
+          <w:lang w:eastAsia="vi-VN"/>
+          <w14:ligatures w14:val="none"/>
+        </w:rPr>
+        <w:t xml:space="preserve"> Thay vì bạn tự khởi tạo đối tượng (ví dụ: new MyService()), Spring sẽ đứng ra quản lý và khởi tạo chúng giúp bạn.</w:t>
+      </w:r>
+    </w:p>
+    <w:p>
+      <w:pPr>
+        <w:numPr>
+          <w:ilvl w:val="0"/>
+          <w:numId w:val="8"/>
+        </w:numPr>
+        <w:spacing w:before="100" w:beforeAutospacing="1" w:after="100" w:afterAutospacing="1" w:line="240" w:lineRule="auto"/>
+        <w:rPr>
+          <w:rFonts w:asciiTheme="majorHAnsi" w:eastAsia="Times New Roman" w:hAnsiTheme="majorHAnsi" w:cstheme="majorHAnsi"/>
+          <w:kern w:val="0"/>
+          <w:sz w:val="24"/>
+          <w:szCs w:val="24"/>
+          <w:lang w:eastAsia="vi-VN"/>
+          <w14:ligatures w14:val="none"/>
+        </w:rPr>
+      </w:pPr>
+      <w:r>
+        <w:rPr>
+          <w:rFonts w:asciiTheme="majorHAnsi" w:eastAsia="Times New Roman" w:hAnsiTheme="majorHAnsi" w:cstheme="majorHAnsi"/>
+          <w:b/>
+          <w:bCs/>
+          <w:kern w:val="0"/>
+          <w:sz w:val="24"/>
+          <w:szCs w:val="24"/>
+          <w:lang w:eastAsia="vi-VN"/>
+          <w14:ligatures w14:val="none"/>
+        </w:rPr>
+        <w:t>Dependency Injection (DI):</w:t>
+      </w:r>
+      <w:r>
+        <w:rPr>
+          <w:rFonts w:asciiTheme="majorHAnsi" w:eastAsia="Times New Roman" w:hAnsiTheme="majorHAnsi" w:cstheme="majorHAnsi"/>
+          <w:kern w:val="0"/>
+          <w:sz w:val="24"/>
+          <w:szCs w:val="24"/>
+          <w:lang w:eastAsia="vi-VN"/>
+          <w14:ligatures w14:val="none"/>
+        </w:rPr>
+        <w:t xml:space="preserve"> Spring tự động "tiêm" các thành phần cần thiết vào một lớp để nó hoạt động, giúp mã nguồn linh hoạt và dễ kiểm thử (test) hơn.</w:t>
+      </w:r>
+    </w:p>
+    <w:p>
+      <w:pPr>
+        <w:pStyle w:val="NormalWeb"/>
+        <w:rPr>
+          <w:rFonts w:asciiTheme="majorHAnsi" w:eastAsia="Times New Roman" w:hAnsiTheme="majorHAnsi" w:cstheme="majorHAnsi"/>
+          <w:kern w:val="0"/>
+          <w:lang w:eastAsia="vi-VN"/>
+          <w14:ligatures w14:val="none"/>
+        </w:rPr>
+      </w:pPr>
+      <w:r>
+        <w:rPr>
+          <w:rFonts w:asciiTheme="majorHAnsi" w:hAnsiTheme="majorHAnsi" w:cstheme="majorHAnsi"/>
+          <w:b/>
+          <w:bCs/>
+          <w:lang w:val="en-US"/>
+        </w:rPr>
+        <w:t>Spring Boot</w:t>
+      </w:r>
+      <w:r>
+        <w:rPr>
+          <w:rFonts w:asciiTheme="majorHAnsi" w:hAnsiTheme="majorHAnsi" w:cstheme="majorHAnsi"/>
+          <w:b/>
+          <w:bCs/>
+          <w:lang w:val="en-US"/>
+        </w:rPr>
+        <w:t xml:space="preserve"> </w:t>
+      </w:r>
+      <w:proofErr w:type="spellStart"/>
+      <w:r>
+        <w:rPr>
+          <w:rFonts w:asciiTheme="majorHAnsi" w:hAnsiTheme="majorHAnsi" w:cstheme="majorHAnsi"/>
+          <w:b/>
+          <w:bCs/>
+          <w:lang w:val="en-US"/>
+        </w:rPr>
+        <w:t>là</w:t>
+      </w:r>
+      <w:proofErr w:type="spellEnd"/>
+      <w:r>
+        <w:rPr>
+          <w:rFonts w:asciiTheme="majorHAnsi" w:hAnsiTheme="majorHAnsi" w:cstheme="majorHAnsi"/>
+          <w:b/>
+          <w:bCs/>
+          <w:lang w:val="en-US"/>
+        </w:rPr>
+        <w:t xml:space="preserve"> gì </w:t>
+      </w:r>
+      <w:r>
+        <w:rPr>
+          <w:rFonts w:asciiTheme="majorHAnsi" w:hAnsiTheme="majorHAnsi" w:cstheme="majorHAnsi"/>
+          <w:lang w:val="en-US"/>
+        </w:rPr>
+        <w:br/>
+      </w:r>
+      <w:r>
+        <w:rPr>
+          <w:rFonts w:asciiTheme="majorHAnsi" w:eastAsia="Times New Roman" w:hAnsiTheme="majorHAnsi" w:cstheme="majorHAnsi"/>
+          <w:kern w:val="0"/>
+          <w:lang w:eastAsia="vi-VN"/>
+          <w14:ligatures w14:val="none"/>
+        </w:rPr>
+        <w:t xml:space="preserve">Nếu Spring Framework giống như một bộ linh kiện máy tính rời rạc (bạn phải tự lắp ráp, cấu hình từng chút một), thì </w:t>
+      </w:r>
+      <w:r>
+        <w:rPr>
+          <w:rFonts w:asciiTheme="majorHAnsi" w:eastAsia="Times New Roman" w:hAnsiTheme="majorHAnsi" w:cstheme="majorHAnsi"/>
+          <w:b/>
+          <w:bCs/>
+          <w:kern w:val="0"/>
+          <w:lang w:eastAsia="vi-VN"/>
+          <w14:ligatures w14:val="none"/>
+        </w:rPr>
+        <w:t>Spring Boot</w:t>
+      </w:r>
+      <w:r>
+        <w:rPr>
+          <w:rFonts w:asciiTheme="majorHAnsi" w:eastAsia="Times New Roman" w:hAnsiTheme="majorHAnsi" w:cstheme="majorHAnsi"/>
+          <w:kern w:val="0"/>
+          <w:lang w:eastAsia="vi-VN"/>
+          <w14:ligatures w14:val="none"/>
+        </w:rPr>
+        <w:t xml:space="preserve"> chính là một chiếc máy tính đã được lắp sẵn và cài đặt mọi thứ, chỉ cần "bật nguồn" là chạy.</w:t>
+      </w:r>
+    </w:p>
+    <w:p>
+      <w:pPr>
+        <w:spacing w:before="100" w:beforeAutospacing="1" w:after="100" w:afterAutospacing="1" w:line="240" w:lineRule="auto"/>
+        <w:rPr>
+          <w:rFonts w:asciiTheme="majorHAnsi" w:eastAsia="Times New Roman" w:hAnsiTheme="majorHAnsi" w:cstheme="majorHAnsi"/>
+          <w:kern w:val="0"/>
+          <w:sz w:val="24"/>
+          <w:szCs w:val="24"/>
+          <w:lang w:val="en-US" w:eastAsia="vi-VN"/>
+          <w14:ligatures w14:val="none"/>
+        </w:rPr>
+      </w:pPr>
+      <w:r>
+        <w:rPr>
+          <w:rFonts w:asciiTheme="majorHAnsi" w:eastAsia="Times New Roman" w:hAnsiTheme="majorHAnsi" w:cstheme="majorHAnsi"/>
+          <w:b/>
+          <w:bCs/>
+          <w:kern w:val="0"/>
+          <w:sz w:val="24"/>
+          <w:szCs w:val="24"/>
+          <w:lang w:eastAsia="vi-VN"/>
+          <w14:ligatures w14:val="none"/>
+        </w:rPr>
+        <w:t>Spring Boot</w:t>
+      </w:r>
+      <w:r>
+        <w:rPr>
+          <w:rFonts w:asciiTheme="majorHAnsi" w:eastAsia="Times New Roman" w:hAnsiTheme="majorHAnsi" w:cstheme="majorHAnsi"/>
+          <w:kern w:val="0"/>
+          <w:sz w:val="24"/>
+          <w:szCs w:val="24"/>
+          <w:lang w:eastAsia="vi-VN"/>
+          <w14:ligatures w14:val="none"/>
+        </w:rPr>
+        <w:t xml:space="preserve"> được xây dựng dựa trên nền tảng Spring Framework nhưng tập trung vào sự tối giản và nhanh chóng. Mục tiêu của nó là giúp bạn tạo ra một ứng dụng có thể chạy ngay lập tức (Ready to run) mà không mất quá nhiều thời gian cấu hình.</w:t>
+      </w:r>
+    </w:p>
+    <w:p>
+      <w:pPr>
+        <w:spacing w:before="100" w:beforeAutospacing="1" w:after="100" w:afterAutospacing="1" w:line="240" w:lineRule="auto"/>
+        <w:rPr>
+          <w:rFonts w:asciiTheme="majorHAnsi" w:eastAsia="Times New Roman" w:hAnsiTheme="majorHAnsi" w:cstheme="majorHAnsi"/>
+          <w:kern w:val="0"/>
+          <w:sz w:val="24"/>
+          <w:szCs w:val="24"/>
+          <w:lang w:eastAsia="vi-VN"/>
+          <w14:ligatures w14:val="none"/>
+        </w:rPr>
+      </w:pPr>
+      <w:r>
+        <w:rPr>
+          <w:rFonts w:asciiTheme="majorHAnsi" w:eastAsia="Times New Roman" w:hAnsiTheme="majorHAnsi" w:cstheme="majorHAnsi"/>
+          <w:b/>
+          <w:bCs/>
+          <w:kern w:val="0"/>
+          <w:sz w:val="24"/>
+          <w:szCs w:val="24"/>
+          <w:lang w:eastAsia="vi-VN"/>
+          <w14:ligatures w14:val="none"/>
+        </w:rPr>
+        <w:t>Đặc điểm nổi bật của Spring Boot:</w:t>
+      </w:r>
+    </w:p>
+    <w:p>
+      <w:pPr>
+        <w:numPr>
+          <w:ilvl w:val="0"/>
+          <w:numId w:val="9"/>
+        </w:numPr>
+        <w:spacing w:before="100" w:beforeAutospacing="1" w:after="100" w:afterAutospacing="1" w:line="240" w:lineRule="auto"/>
+        <w:rPr>
+          <w:rFonts w:asciiTheme="majorHAnsi" w:eastAsia="Times New Roman" w:hAnsiTheme="majorHAnsi" w:cstheme="majorHAnsi"/>
+          <w:kern w:val="0"/>
+          <w:sz w:val="24"/>
+          <w:szCs w:val="24"/>
+          <w:lang w:eastAsia="vi-VN"/>
+          <w14:ligatures w14:val="none"/>
+        </w:rPr>
+      </w:pPr>
+      <w:r>
+        <w:rPr>
+          <w:rFonts w:asciiTheme="majorHAnsi" w:eastAsia="Times New Roman" w:hAnsiTheme="majorHAnsi" w:cstheme="majorHAnsi"/>
+          <w:b/>
+          <w:bCs/>
+          <w:kern w:val="0"/>
+          <w:sz w:val="24"/>
+          <w:szCs w:val="24"/>
+          <w:lang w:eastAsia="vi-VN"/>
+          <w14:ligatures w14:val="none"/>
+        </w:rPr>
+        <w:t>Auto-configuration:</w:t>
+      </w:r>
+      <w:r>
+        <w:rPr>
+          <w:rFonts w:asciiTheme="majorHAnsi" w:eastAsia="Times New Roman" w:hAnsiTheme="majorHAnsi" w:cstheme="majorHAnsi"/>
+          <w:kern w:val="0"/>
+          <w:sz w:val="24"/>
+          <w:szCs w:val="24"/>
+          <w:lang w:eastAsia="vi-VN"/>
+          <w14:ligatures w14:val="none"/>
+        </w:rPr>
+        <w:t xml:space="preserve"> Tự động cấu hình các thư viện dựa trên những gì bạn thêm vào dự án.</w:t>
+      </w:r>
+    </w:p>
+    <w:p>
+      <w:pPr>
+        <w:numPr>
+          <w:ilvl w:val="0"/>
+          <w:numId w:val="9"/>
+        </w:numPr>
+        <w:spacing w:before="100" w:beforeAutospacing="1" w:after="100" w:afterAutospacing="1" w:line="240" w:lineRule="auto"/>
+        <w:rPr>
+          <w:rFonts w:asciiTheme="majorHAnsi" w:eastAsia="Times New Roman" w:hAnsiTheme="majorHAnsi" w:cstheme="majorHAnsi"/>
+          <w:kern w:val="0"/>
+          <w:sz w:val="24"/>
+          <w:szCs w:val="24"/>
+          <w:lang w:eastAsia="vi-VN"/>
+          <w14:ligatures w14:val="none"/>
+        </w:rPr>
+      </w:pPr>
+      <w:r>
+        <w:rPr>
+          <w:rFonts w:asciiTheme="majorHAnsi" w:eastAsia="Times New Roman" w:hAnsiTheme="majorHAnsi" w:cstheme="majorHAnsi"/>
+          <w:b/>
+          <w:bCs/>
+          <w:kern w:val="0"/>
+          <w:sz w:val="24"/>
+          <w:szCs w:val="24"/>
+          <w:lang w:eastAsia="vi-VN"/>
+          <w14:ligatures w14:val="none"/>
+        </w:rPr>
+        <w:t>Embedded Server:</w:t>
+      </w:r>
+      <w:r>
+        <w:rPr>
+          <w:rFonts w:asciiTheme="majorHAnsi" w:eastAsia="Times New Roman" w:hAnsiTheme="majorHAnsi" w:cstheme="majorHAnsi"/>
+          <w:kern w:val="0"/>
+          <w:sz w:val="24"/>
+          <w:szCs w:val="24"/>
+          <w:lang w:eastAsia="vi-VN"/>
+          <w14:ligatures w14:val="none"/>
+        </w:rPr>
+        <w:t xml:space="preserve"> Tích hợp sẵn Server (như Tomcat) bên trong. Bạn không cần cài đặt Server riêng lẻ; ứng dụng sẽ chạy như một file Java thông thường.</w:t>
+      </w:r>
+    </w:p>
+    <w:p>
+      <w:pPr>
+        <w:numPr>
+          <w:ilvl w:val="0"/>
+          <w:numId w:val="9"/>
+        </w:numPr>
+        <w:spacing w:before="100" w:beforeAutospacing="1" w:after="100" w:afterAutospacing="1" w:line="240" w:lineRule="auto"/>
+        <w:rPr>
+          <w:rFonts w:asciiTheme="majorHAnsi" w:eastAsia="Times New Roman" w:hAnsiTheme="majorHAnsi" w:cstheme="majorHAnsi"/>
+          <w:kern w:val="0"/>
+          <w:sz w:val="24"/>
+          <w:szCs w:val="24"/>
+          <w:lang w:eastAsia="vi-VN"/>
+          <w14:ligatures w14:val="none"/>
+        </w:rPr>
+      </w:pPr>
+      <w:r>
+        <w:rPr>
+          <w:rFonts w:asciiTheme="majorHAnsi" w:eastAsia="Times New Roman" w:hAnsiTheme="majorHAnsi" w:cstheme="majorHAnsi"/>
+          <w:b/>
+          <w:bCs/>
+          <w:kern w:val="0"/>
+          <w:sz w:val="24"/>
+          <w:szCs w:val="24"/>
+          <w:lang w:eastAsia="vi-VN"/>
+          <w14:ligatures w14:val="none"/>
+        </w:rPr>
+        <w:lastRenderedPageBreak/>
+        <w:t>Starter Dependencies:</w:t>
+      </w:r>
+      <w:r>
+        <w:rPr>
+          <w:rFonts w:asciiTheme="majorHAnsi" w:eastAsia="Times New Roman" w:hAnsiTheme="majorHAnsi" w:cstheme="majorHAnsi"/>
+          <w:kern w:val="0"/>
+          <w:sz w:val="24"/>
+          <w:szCs w:val="24"/>
+          <w:lang w:eastAsia="vi-VN"/>
+          <w14:ligatures w14:val="none"/>
+        </w:rPr>
+        <w:t xml:space="preserve"> Cung cấp các gói thư viện "mồi" (Starters) để gom nhóm các công nghệ liên quan (ví dụ: spring-boot-starter-web sẽ tự động tải về mọi thứ cần để làm website).</w:t>
+      </w:r>
+    </w:p>
+    <w:p>
+      <w:pPr>
+        <w:pStyle w:val="NormalWeb"/>
+        <w:rPr>
+          <w:rFonts w:asciiTheme="majorHAnsi" w:hAnsiTheme="majorHAnsi" w:cstheme="majorHAnsi"/>
+          <w:b/>
+          <w:bCs/>
+          <w:lang w:val="en-US"/>
+        </w:rPr>
+      </w:pPr>
+    </w:p>
+    <w:p>
+      <w:pPr>
+        <w:rPr>
+          <w:rFonts w:asciiTheme="majorHAnsi" w:hAnsiTheme="majorHAnsi" w:cstheme="majorHAnsi"/>
+          <w:b/>
+          <w:bCs/>
+          <w:sz w:val="24"/>
+          <w:szCs w:val="24"/>
+          <w:lang w:val="en-US"/>
+        </w:rPr>
+      </w:pPr>
+      <w:r>
+        <w:rPr>
+          <w:rFonts w:asciiTheme="majorHAnsi" w:hAnsiTheme="majorHAnsi" w:cstheme="majorHAnsi"/>
+          <w:b/>
+          <w:bCs/>
+          <w:sz w:val="24"/>
+          <w:szCs w:val="24"/>
+          <w:lang w:val="en-US"/>
+        </w:rPr>
+        <w:t xml:space="preserve">Git </w:t>
+      </w:r>
+      <w:proofErr w:type="spellStart"/>
+      <w:r>
+        <w:rPr>
+          <w:rFonts w:asciiTheme="majorHAnsi" w:hAnsiTheme="majorHAnsi" w:cstheme="majorHAnsi"/>
+          <w:b/>
+          <w:bCs/>
+          <w:sz w:val="24"/>
+          <w:szCs w:val="24"/>
+          <w:lang w:val="en-US"/>
+        </w:rPr>
+        <w:t>là</w:t>
+      </w:r>
+      <w:proofErr w:type="spellEnd"/>
+      <w:r>
+        <w:rPr>
+          <w:rFonts w:asciiTheme="majorHAnsi" w:hAnsiTheme="majorHAnsi" w:cstheme="majorHAnsi"/>
+          <w:b/>
+          <w:bCs/>
+          <w:sz w:val="24"/>
+          <w:szCs w:val="24"/>
+          <w:lang w:val="en-US"/>
+        </w:rPr>
+        <w:t xml:space="preserve"> </w:t>
+      </w:r>
+      <w:proofErr w:type="spellStart"/>
+      <w:r>
+        <w:rPr>
+          <w:rFonts w:asciiTheme="majorHAnsi" w:hAnsiTheme="majorHAnsi" w:cstheme="majorHAnsi"/>
+          <w:b/>
+          <w:bCs/>
+          <w:sz w:val="24"/>
+          <w:szCs w:val="24"/>
+          <w:lang w:val="en-US"/>
+        </w:rPr>
+        <w:t>gì</w:t>
+      </w:r>
+      <w:proofErr w:type="spellEnd"/>
+      <w:r>
+        <w:rPr>
+          <w:rFonts w:asciiTheme="majorHAnsi" w:hAnsiTheme="majorHAnsi" w:cstheme="majorHAnsi"/>
+          <w:b/>
+          <w:bCs/>
+          <w:sz w:val="24"/>
+          <w:szCs w:val="24"/>
+          <w:lang w:val="en-US"/>
+        </w:rPr>
+        <w:t xml:space="preserve">, </w:t>
+      </w:r>
+      <w:proofErr w:type="spellStart"/>
+      <w:r>
+        <w:rPr>
+          <w:rFonts w:asciiTheme="majorHAnsi" w:hAnsiTheme="majorHAnsi" w:cstheme="majorHAnsi"/>
+          <w:b/>
+          <w:bCs/>
+          <w:sz w:val="24"/>
+          <w:szCs w:val="24"/>
+          <w:lang w:val="en-US"/>
+        </w:rPr>
+        <w:t>ưu</w:t>
+      </w:r>
+      <w:proofErr w:type="spellEnd"/>
+      <w:r>
+        <w:rPr>
+          <w:rFonts w:asciiTheme="majorHAnsi" w:hAnsiTheme="majorHAnsi" w:cstheme="majorHAnsi"/>
+          <w:b/>
+          <w:bCs/>
+          <w:sz w:val="24"/>
+          <w:szCs w:val="24"/>
+          <w:lang w:val="en-US"/>
+        </w:rPr>
+        <w:t xml:space="preserve"> </w:t>
+      </w:r>
+      <w:proofErr w:type="spellStart"/>
+      <w:r>
+        <w:rPr>
+          <w:rFonts w:asciiTheme="majorHAnsi" w:hAnsiTheme="majorHAnsi" w:cstheme="majorHAnsi"/>
+          <w:b/>
+          <w:bCs/>
+          <w:sz w:val="24"/>
+          <w:szCs w:val="24"/>
+          <w:lang w:val="en-US"/>
+        </w:rPr>
+        <w:t>điểm</w:t>
+      </w:r>
+      <w:proofErr w:type="spellEnd"/>
+      <w:r>
+        <w:rPr>
+          <w:rFonts w:asciiTheme="majorHAnsi" w:hAnsiTheme="majorHAnsi" w:cstheme="majorHAnsi"/>
+          <w:b/>
+          <w:bCs/>
+          <w:sz w:val="24"/>
+          <w:szCs w:val="24"/>
+          <w:lang w:val="en-US"/>
+        </w:rPr>
+        <w:t xml:space="preserve">. </w:t>
+      </w:r>
+      <w:proofErr w:type="spellStart"/>
+      <w:r>
+        <w:rPr>
+          <w:rFonts w:asciiTheme="majorHAnsi" w:hAnsiTheme="majorHAnsi" w:cstheme="majorHAnsi"/>
+          <w:b/>
+          <w:bCs/>
+          <w:sz w:val="24"/>
+          <w:szCs w:val="24"/>
+          <w:lang w:val="en-US"/>
+        </w:rPr>
+        <w:t>Một</w:t>
+      </w:r>
+      <w:proofErr w:type="spellEnd"/>
+      <w:r>
+        <w:rPr>
+          <w:rFonts w:asciiTheme="majorHAnsi" w:hAnsiTheme="majorHAnsi" w:cstheme="majorHAnsi"/>
+          <w:b/>
+          <w:bCs/>
+          <w:sz w:val="24"/>
+          <w:szCs w:val="24"/>
+          <w:lang w:val="en-US"/>
+        </w:rPr>
+        <w:t xml:space="preserve"> </w:t>
+      </w:r>
+      <w:proofErr w:type="spellStart"/>
+      <w:r>
+        <w:rPr>
+          <w:rFonts w:asciiTheme="majorHAnsi" w:hAnsiTheme="majorHAnsi" w:cstheme="majorHAnsi"/>
+          <w:b/>
+          <w:bCs/>
+          <w:sz w:val="24"/>
+          <w:szCs w:val="24"/>
+          <w:lang w:val="en-US"/>
+        </w:rPr>
+        <w:t>số</w:t>
+      </w:r>
+      <w:proofErr w:type="spellEnd"/>
+      <w:r>
+        <w:rPr>
+          <w:rFonts w:asciiTheme="majorHAnsi" w:hAnsiTheme="majorHAnsi" w:cstheme="majorHAnsi"/>
+          <w:b/>
+          <w:bCs/>
+          <w:sz w:val="24"/>
+          <w:szCs w:val="24"/>
+          <w:lang w:val="en-US"/>
+        </w:rPr>
+        <w:t xml:space="preserve"> </w:t>
+      </w:r>
+      <w:proofErr w:type="spellStart"/>
+      <w:r>
+        <w:rPr>
+          <w:rFonts w:asciiTheme="majorHAnsi" w:hAnsiTheme="majorHAnsi" w:cstheme="majorHAnsi"/>
+          <w:b/>
+          <w:bCs/>
+          <w:sz w:val="24"/>
+          <w:szCs w:val="24"/>
+          <w:lang w:val="en-US"/>
+        </w:rPr>
+        <w:t>lệnh</w:t>
+      </w:r>
+      <w:proofErr w:type="spellEnd"/>
+      <w:r>
+        <w:rPr>
+          <w:rFonts w:asciiTheme="majorHAnsi" w:hAnsiTheme="majorHAnsi" w:cstheme="majorHAnsi"/>
+          <w:b/>
+          <w:bCs/>
+          <w:sz w:val="24"/>
+          <w:szCs w:val="24"/>
+          <w:lang w:val="en-US"/>
+        </w:rPr>
+        <w:t xml:space="preserve"> </w:t>
+      </w:r>
+      <w:proofErr w:type="spellStart"/>
+      <w:r>
+        <w:rPr>
+          <w:rFonts w:asciiTheme="majorHAnsi" w:hAnsiTheme="majorHAnsi" w:cstheme="majorHAnsi"/>
+          <w:b/>
+          <w:bCs/>
+          <w:sz w:val="24"/>
+          <w:szCs w:val="24"/>
+          <w:lang w:val="en-US"/>
+        </w:rPr>
+        <w:t>cơ</w:t>
+      </w:r>
+      <w:proofErr w:type="spellEnd"/>
+      <w:r>
+        <w:rPr>
+          <w:rFonts w:asciiTheme="majorHAnsi" w:hAnsiTheme="majorHAnsi" w:cstheme="majorHAnsi"/>
+          <w:b/>
+          <w:bCs/>
+          <w:sz w:val="24"/>
+          <w:szCs w:val="24"/>
+          <w:lang w:val="en-US"/>
+        </w:rPr>
+        <w:t xml:space="preserve"> </w:t>
+      </w:r>
+      <w:proofErr w:type="spellStart"/>
+      <w:r>
+        <w:rPr>
+          <w:rFonts w:asciiTheme="majorHAnsi" w:hAnsiTheme="majorHAnsi" w:cstheme="majorHAnsi"/>
+          <w:b/>
+          <w:bCs/>
+          <w:sz w:val="24"/>
+          <w:szCs w:val="24"/>
+          <w:lang w:val="en-US"/>
+        </w:rPr>
+        <w:t>bản</w:t>
+      </w:r>
+      <w:proofErr w:type="spellEnd"/>
+      <w:r>
+        <w:rPr>
+          <w:rFonts w:asciiTheme="majorHAnsi" w:hAnsiTheme="majorHAnsi" w:cstheme="majorHAnsi"/>
+          <w:b/>
+          <w:bCs/>
+          <w:sz w:val="24"/>
+          <w:szCs w:val="24"/>
+          <w:lang w:val="en-US"/>
+        </w:rPr>
+        <w:t xml:space="preserve"> </w:t>
+      </w:r>
+      <w:proofErr w:type="spellStart"/>
+      <w:r>
+        <w:rPr>
+          <w:rFonts w:asciiTheme="majorHAnsi" w:hAnsiTheme="majorHAnsi" w:cstheme="majorHAnsi"/>
+          <w:b/>
+          <w:bCs/>
+          <w:sz w:val="24"/>
+          <w:szCs w:val="24"/>
+          <w:lang w:val="en-US"/>
+        </w:rPr>
+        <w:t>trong</w:t>
+      </w:r>
+      <w:proofErr w:type="spellEnd"/>
+      <w:r>
+        <w:rPr>
+          <w:rFonts w:asciiTheme="majorHAnsi" w:hAnsiTheme="majorHAnsi" w:cstheme="majorHAnsi"/>
+          <w:b/>
+          <w:bCs/>
+          <w:sz w:val="24"/>
+          <w:szCs w:val="24"/>
+          <w:lang w:val="en-US"/>
+        </w:rPr>
+        <w:t xml:space="preserve"> Git </w:t>
+      </w:r>
+      <w:r>
+        <w:rPr>
+          <w:rFonts w:asciiTheme="majorHAnsi" w:hAnsiTheme="majorHAnsi" w:cstheme="majorHAnsi"/>
+          <w:b/>
+          <w:bCs/>
+          <w:sz w:val="24"/>
+          <w:szCs w:val="24"/>
+          <w:lang w:val="en-US"/>
+        </w:rPr>
+        <w:br/>
+      </w:r>
+      <w:r>
+        <w:rPr>
+          <w:rFonts w:asciiTheme="majorHAnsi" w:eastAsia="Times New Roman" w:hAnsiTheme="majorHAnsi" w:cstheme="majorHAnsi"/>
+          <w:kern w:val="0"/>
+          <w:sz w:val="24"/>
+          <w:szCs w:val="24"/>
+          <w:lang w:eastAsia="vi-VN"/>
+          <w14:ligatures w14:val="none"/>
+        </w:rPr>
+        <w:t>Git là hệ thống quản lý phiên bản (Version Control System) dùng để theo dõi và quản lý thay đổi của source code.</w:t>
+      </w:r>
+    </w:p>
+    <w:p>
+      <w:pPr>
+        <w:spacing w:before="100" w:beforeAutospacing="1" w:after="100" w:afterAutospacing="1" w:line="240" w:lineRule="auto"/>
+        <w:rPr>
+          <w:rFonts w:asciiTheme="majorHAnsi" w:eastAsia="Times New Roman" w:hAnsiTheme="majorHAnsi" w:cstheme="majorHAnsi"/>
+          <w:kern w:val="0"/>
+          <w:sz w:val="24"/>
+          <w:szCs w:val="24"/>
+          <w:lang w:eastAsia="vi-VN"/>
+          <w14:ligatures w14:val="none"/>
+        </w:rPr>
+      </w:pPr>
+      <w:r>
+        <w:rPr>
+          <w:rFonts w:asciiTheme="majorHAnsi" w:eastAsia="Times New Roman" w:hAnsiTheme="majorHAnsi" w:cstheme="majorHAnsi"/>
+          <w:kern w:val="0"/>
+          <w:sz w:val="24"/>
+          <w:szCs w:val="24"/>
+          <w:lang w:eastAsia="vi-VN"/>
+          <w14:ligatures w14:val="none"/>
+        </w:rPr>
+        <w:t>Nó giúp:</w:t>
+      </w:r>
+    </w:p>
+    <w:p>
+      <w:pPr>
+        <w:numPr>
+          <w:ilvl w:val="0"/>
+          <w:numId w:val="3"/>
+        </w:numPr>
+        <w:spacing w:before="100" w:beforeAutospacing="1" w:after="100" w:afterAutospacing="1" w:line="240" w:lineRule="auto"/>
+        <w:rPr>
+          <w:rFonts w:asciiTheme="majorHAnsi" w:eastAsia="Times New Roman" w:hAnsiTheme="majorHAnsi" w:cstheme="majorHAnsi"/>
+          <w:kern w:val="0"/>
+          <w:sz w:val="24"/>
+          <w:szCs w:val="24"/>
+          <w:lang w:eastAsia="vi-VN"/>
+          <w14:ligatures w14:val="none"/>
+        </w:rPr>
+      </w:pPr>
+      <w:r>
+        <w:rPr>
+          <w:rFonts w:asciiTheme="majorHAnsi" w:eastAsia="Times New Roman" w:hAnsiTheme="majorHAnsi" w:cstheme="majorHAnsi"/>
+          <w:kern w:val="0"/>
+          <w:sz w:val="24"/>
+          <w:szCs w:val="24"/>
+          <w:lang w:eastAsia="vi-VN"/>
+          <w14:ligatures w14:val="none"/>
+        </w:rPr>
+        <w:t xml:space="preserve">Lưu lịch sử code </w:t>
+      </w:r>
+    </w:p>
+    <w:p>
+      <w:pPr>
+        <w:numPr>
+          <w:ilvl w:val="0"/>
+          <w:numId w:val="3"/>
+        </w:numPr>
+        <w:spacing w:before="100" w:beforeAutospacing="1" w:after="100" w:afterAutospacing="1" w:line="240" w:lineRule="auto"/>
+        <w:rPr>
+          <w:rFonts w:asciiTheme="majorHAnsi" w:eastAsia="Times New Roman" w:hAnsiTheme="majorHAnsi" w:cstheme="majorHAnsi"/>
+          <w:kern w:val="0"/>
+          <w:sz w:val="24"/>
+          <w:szCs w:val="24"/>
+          <w:lang w:eastAsia="vi-VN"/>
+          <w14:ligatures w14:val="none"/>
+        </w:rPr>
+      </w:pPr>
+      <w:r>
+        <w:rPr>
+          <w:rFonts w:asciiTheme="majorHAnsi" w:eastAsia="Times New Roman" w:hAnsiTheme="majorHAnsi" w:cstheme="majorHAnsi"/>
+          <w:kern w:val="0"/>
+          <w:sz w:val="24"/>
+          <w:szCs w:val="24"/>
+          <w:lang w:eastAsia="vi-VN"/>
+          <w14:ligatures w14:val="none"/>
+        </w:rPr>
+        <w:t xml:space="preserve">Quay lại phiên bản cũ </w:t>
+      </w:r>
+    </w:p>
+    <w:p>
+      <w:pPr>
+        <w:numPr>
+          <w:ilvl w:val="0"/>
+          <w:numId w:val="3"/>
+        </w:numPr>
+        <w:spacing w:before="100" w:beforeAutospacing="1" w:after="100" w:afterAutospacing="1" w:line="240" w:lineRule="auto"/>
+        <w:rPr>
+          <w:rFonts w:asciiTheme="majorHAnsi" w:eastAsia="Times New Roman" w:hAnsiTheme="majorHAnsi" w:cstheme="majorHAnsi"/>
+          <w:kern w:val="0"/>
+          <w:sz w:val="24"/>
+          <w:szCs w:val="24"/>
+          <w:lang w:eastAsia="vi-VN"/>
+          <w14:ligatures w14:val="none"/>
+        </w:rPr>
+      </w:pPr>
+      <w:r>
+        <w:rPr>
+          <w:rFonts w:asciiTheme="majorHAnsi" w:eastAsia="Times New Roman" w:hAnsiTheme="majorHAnsi" w:cstheme="majorHAnsi"/>
+          <w:kern w:val="0"/>
+          <w:sz w:val="24"/>
+          <w:szCs w:val="24"/>
+          <w:lang w:eastAsia="vi-VN"/>
+          <w14:ligatures w14:val="none"/>
+        </w:rPr>
+        <w:t xml:space="preserve">Làm việc nhóm </w:t>
+      </w:r>
+    </w:p>
+    <w:p>
+      <w:pPr>
+        <w:numPr>
+          <w:ilvl w:val="0"/>
+          <w:numId w:val="3"/>
+        </w:numPr>
+        <w:spacing w:before="100" w:beforeAutospacing="1" w:after="100" w:afterAutospacing="1" w:line="240" w:lineRule="auto"/>
+        <w:rPr>
+          <w:rFonts w:asciiTheme="majorHAnsi" w:eastAsia="Times New Roman" w:hAnsiTheme="majorHAnsi" w:cstheme="majorHAnsi"/>
+          <w:kern w:val="0"/>
+          <w:sz w:val="24"/>
+          <w:szCs w:val="24"/>
+          <w:lang w:eastAsia="vi-VN"/>
+          <w14:ligatures w14:val="none"/>
+        </w:rPr>
+      </w:pPr>
+      <w:r>
+        <w:rPr>
+          <w:rFonts w:asciiTheme="majorHAnsi" w:eastAsia="Times New Roman" w:hAnsiTheme="majorHAnsi" w:cstheme="majorHAnsi"/>
+          <w:kern w:val="0"/>
+          <w:sz w:val="24"/>
+          <w:szCs w:val="24"/>
+          <w:lang w:eastAsia="vi-VN"/>
+          <w14:ligatures w14:val="none"/>
+        </w:rPr>
+        <w:t xml:space="preserve">Merge code </w:t>
+      </w:r>
+    </w:p>
+    <w:p>
+      <w:pPr>
+        <w:numPr>
+          <w:ilvl w:val="0"/>
+          <w:numId w:val="3"/>
+        </w:numPr>
+        <w:spacing w:before="100" w:beforeAutospacing="1" w:after="100" w:afterAutospacing="1" w:line="240" w:lineRule="auto"/>
+        <w:rPr>
+          <w:rFonts w:asciiTheme="majorHAnsi" w:eastAsia="Times New Roman" w:hAnsiTheme="majorHAnsi" w:cstheme="majorHAnsi"/>
+          <w:kern w:val="0"/>
+          <w:sz w:val="24"/>
+          <w:szCs w:val="24"/>
+          <w:lang w:eastAsia="vi-VN"/>
+          <w14:ligatures w14:val="none"/>
+        </w:rPr>
+      </w:pPr>
+      <w:r>
+        <w:rPr>
+          <w:rFonts w:asciiTheme="majorHAnsi" w:eastAsia="Times New Roman" w:hAnsiTheme="majorHAnsi" w:cstheme="majorHAnsi"/>
+          <w:kern w:val="0"/>
+          <w:sz w:val="24"/>
+          <w:szCs w:val="24"/>
+          <w:lang w:eastAsia="vi-VN"/>
+          <w14:ligatures w14:val="none"/>
+        </w:rPr>
+        <w:t xml:space="preserve">Quản lý branch </w:t>
+      </w:r>
+    </w:p>
+    <w:p>
+      <w:pPr>
+        <w:rPr>
+          <w:rFonts w:asciiTheme="majorHAnsi" w:eastAsia="Times New Roman" w:hAnsiTheme="majorHAnsi" w:cstheme="majorHAnsi"/>
+          <w:kern w:val="0"/>
+          <w:sz w:val="24"/>
+          <w:szCs w:val="24"/>
+          <w:lang w:eastAsia="vi-VN"/>
+          <w14:ligatures w14:val="none"/>
+        </w:rPr>
+      </w:pPr>
+      <w:r>
+        <w:rPr>
+          <w:rFonts w:asciiTheme="majorHAnsi" w:eastAsia="Times New Roman" w:hAnsiTheme="majorHAnsi" w:cstheme="majorHAnsi"/>
+          <w:kern w:val="0"/>
+          <w:sz w:val="24"/>
+          <w:szCs w:val="24"/>
+          <w:lang w:eastAsia="vi-VN"/>
+          <w14:ligatures w14:val="none"/>
+        </w:rPr>
+        <w:t>Ví dụ:</w:t>
+      </w:r>
+    </w:p>
+    <w:p>
+      <w:pPr>
+        <w:pStyle w:val="NormalWeb"/>
+        <w:pBdr>
+          <w:top w:val="single" w:sz="6" w:space="2" w:color="888888"/>
+          <w:left w:val="single" w:sz="6" w:space="2" w:color="888888"/>
+          <w:bottom w:val="single" w:sz="6" w:space="2" w:color="888888"/>
+          <w:right w:val="single" w:sz="6" w:space="2" w:color="888888"/>
+        </w:pBdr>
+        <w:shd w:val="clear" w:color="auto" w:fill="2B2B2B"/>
         <w:tabs>
           <w:tab w:val="left" w:pos="916"/>
           <w:tab w:val="left" w:pos="1832"/>
@@ -1680,1307 +2801,10 @@
           <w:tab w:val="left" w:pos="13740"/>
           <w:tab w:val="left" w:pos="14656"/>
         </w:tabs>
-        <w:spacing w:after="0" w:line="240" w:lineRule="auto"/>
-        <w:rPr>
-          <w:rFonts w:asciiTheme="majorHAnsi" w:eastAsia="Times New Roman" w:hAnsiTheme="majorHAnsi" w:cstheme="majorHAnsi"/>
-          <w:color w:val="444746"/>
-          <w:kern w:val="0"/>
-          <w:sz w:val="24"/>
-          <w:szCs w:val="24"/>
-          <w:bdr w:val="none" w:sz="0" w:space="0" w:color="auto" w:frame="1"/>
-          <w:lang w:eastAsia="vi-VN"/>
-          <w14:ligatures w14:val="none"/>
-        </w:rPr>
-      </w:pPr>
-    </w:p>
-    <w:p>
-      <w:pPr>
-        <w:spacing w:after="120" w:line="240" w:lineRule="auto"/>
-        <w:outlineLvl w:val="1"/>
-        <w:rPr>
-          <w:rFonts w:asciiTheme="majorHAnsi" w:eastAsia="Times New Roman" w:hAnsiTheme="majorHAnsi" w:cstheme="majorHAnsi"/>
-          <w:b/>
-          <w:bCs/>
-          <w:color w:val="1F1F1F"/>
-          <w:kern w:val="0"/>
-          <w:sz w:val="24"/>
-          <w:szCs w:val="24"/>
-          <w:lang w:eastAsia="vi-VN"/>
-          <w14:ligatures w14:val="none"/>
-        </w:rPr>
-      </w:pPr>
-      <w:r>
-        <w:rPr>
-          <w:rFonts w:asciiTheme="majorHAnsi" w:eastAsia="Times New Roman" w:hAnsiTheme="majorHAnsi" w:cstheme="majorHAnsi"/>
-          <w:b/>
-          <w:bCs/>
-          <w:color w:val="1F1F1F"/>
-          <w:kern w:val="0"/>
-          <w:sz w:val="24"/>
-          <w:szCs w:val="24"/>
-          <w:lang w:eastAsia="vi-VN"/>
-          <w14:ligatures w14:val="none"/>
-        </w:rPr>
-        <w:t>5. Mối quan hệ giữa JPA và Hibernate</w:t>
-      </w:r>
-    </w:p>
-    <w:p>
-      <w:pPr>
-        <w:spacing w:after="150" w:line="240" w:lineRule="auto"/>
-        <w:rPr>
-          <w:rFonts w:asciiTheme="majorHAnsi" w:eastAsia="Times New Roman" w:hAnsiTheme="majorHAnsi" w:cstheme="majorHAnsi"/>
-          <w:color w:val="1F1F1F"/>
-          <w:kern w:val="0"/>
-          <w:sz w:val="24"/>
-          <w:szCs w:val="24"/>
-          <w:lang w:eastAsia="vi-VN"/>
-          <w14:ligatures w14:val="none"/>
-        </w:rPr>
-      </w:pPr>
-      <w:r>
-        <w:rPr>
-          <w:rFonts w:asciiTheme="majorHAnsi" w:eastAsia="Times New Roman" w:hAnsiTheme="majorHAnsi" w:cstheme="majorHAnsi"/>
-          <w:color w:val="1F1F1F"/>
-          <w:kern w:val="0"/>
-          <w:sz w:val="24"/>
-          <w:szCs w:val="24"/>
-          <w:lang w:eastAsia="vi-VN"/>
-          <w14:ligatures w14:val="none"/>
-        </w:rPr>
-        <w:t>Một nhầm lẫn phổ biến là coi JPA và Hibernate là một. Thực tế:</w:t>
-      </w:r>
-    </w:p>
-    <w:p>
-      <w:pPr>
-        <w:numPr>
-          <w:ilvl w:val="0"/>
-          <w:numId w:val="7"/>
-        </w:numPr>
-        <w:spacing w:after="0" w:line="240" w:lineRule="auto"/>
-        <w:rPr>
-          <w:rFonts w:asciiTheme="majorHAnsi" w:eastAsia="Times New Roman" w:hAnsiTheme="majorHAnsi" w:cstheme="majorHAnsi"/>
-          <w:color w:val="1F1F1F"/>
-          <w:kern w:val="0"/>
-          <w:sz w:val="24"/>
-          <w:szCs w:val="24"/>
-          <w:lang w:eastAsia="vi-VN"/>
-          <w14:ligatures w14:val="none"/>
-        </w:rPr>
-      </w:pPr>
-      <w:r>
-        <w:rPr>
-          <w:rFonts w:asciiTheme="majorHAnsi" w:eastAsia="Times New Roman" w:hAnsiTheme="majorHAnsi" w:cstheme="majorHAnsi"/>
-          <w:b/>
-          <w:bCs/>
-          <w:color w:val="1F1F1F"/>
-          <w:kern w:val="0"/>
-          <w:sz w:val="24"/>
-          <w:szCs w:val="24"/>
-          <w:bdr w:val="none" w:sz="0" w:space="0" w:color="auto" w:frame="1"/>
-          <w:lang w:eastAsia="vi-VN"/>
-          <w14:ligatures w14:val="none"/>
-        </w:rPr>
-        <w:t>JPA</w:t>
-      </w:r>
-      <w:r>
-        <w:rPr>
-          <w:rFonts w:asciiTheme="majorHAnsi" w:eastAsia="Times New Roman" w:hAnsiTheme="majorHAnsi" w:cstheme="majorHAnsi"/>
-          <w:color w:val="1F1F1F"/>
-          <w:kern w:val="0"/>
-          <w:sz w:val="24"/>
-          <w:szCs w:val="24"/>
-          <w:lang w:eastAsia="vi-VN"/>
-          <w14:ligatures w14:val="none"/>
-        </w:rPr>
-        <w:t xml:space="preserve"> là </w:t>
-      </w:r>
-      <w:r>
-        <w:rPr>
-          <w:rFonts w:asciiTheme="majorHAnsi" w:eastAsia="Times New Roman" w:hAnsiTheme="majorHAnsi" w:cstheme="majorHAnsi"/>
-          <w:b/>
-          <w:bCs/>
-          <w:color w:val="1F1F1F"/>
-          <w:kern w:val="0"/>
-          <w:sz w:val="24"/>
-          <w:szCs w:val="24"/>
-          <w:bdr w:val="none" w:sz="0" w:space="0" w:color="auto" w:frame="1"/>
-          <w:lang w:eastAsia="vi-VN"/>
-          <w14:ligatures w14:val="none"/>
-        </w:rPr>
-        <w:t>giao diện/tiêu chuẩn</w:t>
-      </w:r>
-      <w:r>
-        <w:rPr>
-          <w:rFonts w:asciiTheme="majorHAnsi" w:eastAsia="Times New Roman" w:hAnsiTheme="majorHAnsi" w:cstheme="majorHAnsi"/>
-          <w:color w:val="1F1F1F"/>
-          <w:kern w:val="0"/>
-          <w:sz w:val="24"/>
-          <w:szCs w:val="24"/>
-          <w:lang w:eastAsia="vi-VN"/>
-          <w14:ligatures w14:val="none"/>
-        </w:rPr>
-        <w:t>: Nó đưa ra các quy tắc và hướng dẫn (như một bản thiết kế).</w:t>
-      </w:r>
-    </w:p>
-    <w:p>
-      <w:pPr>
-        <w:numPr>
-          <w:ilvl w:val="0"/>
-          <w:numId w:val="7"/>
-        </w:numPr>
-        <w:spacing w:after="0" w:line="240" w:lineRule="auto"/>
-        <w:rPr>
-          <w:rFonts w:asciiTheme="majorHAnsi" w:eastAsia="Times New Roman" w:hAnsiTheme="majorHAnsi" w:cstheme="majorHAnsi"/>
-          <w:color w:val="1F1F1F"/>
-          <w:kern w:val="0"/>
-          <w:sz w:val="24"/>
-          <w:szCs w:val="24"/>
-          <w:lang w:eastAsia="vi-VN"/>
-          <w14:ligatures w14:val="none"/>
-        </w:rPr>
-      </w:pPr>
-      <w:r>
-        <w:rPr>
-          <w:rFonts w:asciiTheme="majorHAnsi" w:eastAsia="Times New Roman" w:hAnsiTheme="majorHAnsi" w:cstheme="majorHAnsi"/>
-          <w:b/>
-          <w:bCs/>
-          <w:color w:val="1F1F1F"/>
-          <w:kern w:val="0"/>
-          <w:sz w:val="24"/>
-          <w:szCs w:val="24"/>
-          <w:bdr w:val="none" w:sz="0" w:space="0" w:color="auto" w:frame="1"/>
-          <w:lang w:eastAsia="vi-VN"/>
-          <w14:ligatures w14:val="none"/>
-        </w:rPr>
-        <w:t>Hibernate</w:t>
-      </w:r>
-      <w:r>
-        <w:rPr>
-          <w:rFonts w:asciiTheme="majorHAnsi" w:eastAsia="Times New Roman" w:hAnsiTheme="majorHAnsi" w:cstheme="majorHAnsi"/>
-          <w:color w:val="1F1F1F"/>
-          <w:kern w:val="0"/>
-          <w:sz w:val="24"/>
-          <w:szCs w:val="24"/>
-          <w:lang w:eastAsia="vi-VN"/>
-          <w14:ligatures w14:val="none"/>
-        </w:rPr>
-        <w:t xml:space="preserve"> là </w:t>
-      </w:r>
-      <w:r>
-        <w:rPr>
-          <w:rFonts w:asciiTheme="majorHAnsi" w:eastAsia="Times New Roman" w:hAnsiTheme="majorHAnsi" w:cstheme="majorHAnsi"/>
-          <w:b/>
-          <w:bCs/>
-          <w:color w:val="1F1F1F"/>
-          <w:kern w:val="0"/>
-          <w:sz w:val="24"/>
-          <w:szCs w:val="24"/>
-          <w:bdr w:val="none" w:sz="0" w:space="0" w:color="auto" w:frame="1"/>
-          <w:lang w:eastAsia="vi-VN"/>
-          <w14:ligatures w14:val="none"/>
-        </w:rPr>
-        <w:t>triển khai (Implementation)</w:t>
-      </w:r>
-      <w:r>
-        <w:rPr>
-          <w:rFonts w:asciiTheme="majorHAnsi" w:eastAsia="Times New Roman" w:hAnsiTheme="majorHAnsi" w:cstheme="majorHAnsi"/>
-          <w:color w:val="1F1F1F"/>
-          <w:kern w:val="0"/>
-          <w:sz w:val="24"/>
-          <w:szCs w:val="24"/>
-          <w:lang w:eastAsia="vi-VN"/>
-          <w14:ligatures w14:val="none"/>
-        </w:rPr>
-        <w:t>: Nó là thư viện cụ thể thực hiện các quy tắc mà JPA đề ra. Bạn có thể hiểu JPA là giao diện điều khiển, còn Hibernate là động cơ bên dưới.</w:t>
-      </w:r>
-    </w:p>
-    <w:p>
-      <w:pPr>
-        <w:rPr>
-          <w:rFonts w:asciiTheme="majorHAnsi" w:hAnsiTheme="majorHAnsi" w:cstheme="majorHAnsi"/>
-          <w:b/>
-          <w:bCs/>
-          <w:sz w:val="24"/>
-          <w:szCs w:val="24"/>
-          <w:lang w:val="en-US"/>
-        </w:rPr>
-      </w:pPr>
-      <w:r>
-        <w:rPr>
-          <w:rFonts w:asciiTheme="majorHAnsi" w:hAnsiTheme="majorHAnsi" w:cstheme="majorHAnsi"/>
-          <w:b/>
-          <w:bCs/>
-          <w:sz w:val="24"/>
-          <w:szCs w:val="24"/>
-          <w:lang w:val="en-US"/>
-        </w:rPr>
-        <w:br/>
-      </w:r>
-    </w:p>
-    <w:p>
-      <w:pPr>
-        <w:rPr>
-          <w:rFonts w:asciiTheme="majorHAnsi" w:hAnsiTheme="majorHAnsi" w:cstheme="majorHAnsi"/>
-          <w:b/>
-          <w:bCs/>
-          <w:sz w:val="24"/>
-          <w:szCs w:val="24"/>
-          <w:lang w:val="en-US"/>
-        </w:rPr>
-      </w:pPr>
-      <w:r>
-        <w:rPr>
-          <w:rFonts w:asciiTheme="majorHAnsi" w:hAnsiTheme="majorHAnsi" w:cstheme="majorHAnsi"/>
-          <w:b/>
-          <w:bCs/>
-          <w:sz w:val="24"/>
-          <w:szCs w:val="24"/>
-          <w:lang w:val="en-US"/>
-        </w:rPr>
-        <w:br w:type="page"/>
-      </w:r>
-    </w:p>
-    <w:p>
-      <w:pPr>
-        <w:pStyle w:val="NormalWeb"/>
-        <w:rPr>
-          <w:rFonts w:asciiTheme="majorHAnsi" w:hAnsiTheme="majorHAnsi" w:cstheme="majorHAnsi"/>
-          <w:b/>
-          <w:bCs/>
-          <w:lang w:val="en-US"/>
-        </w:rPr>
-      </w:pPr>
-      <w:r>
-        <w:rPr>
-          <w:rFonts w:asciiTheme="majorHAnsi" w:hAnsiTheme="majorHAnsi" w:cstheme="majorHAnsi"/>
-          <w:b/>
-          <w:bCs/>
-          <w:lang w:val="en-US"/>
-        </w:rPr>
-        <w:lastRenderedPageBreak/>
-        <w:t xml:space="preserve">Spring Framework </w:t>
-      </w:r>
-      <w:proofErr w:type="spellStart"/>
-      <w:r>
-        <w:rPr>
-          <w:rFonts w:asciiTheme="majorHAnsi" w:hAnsiTheme="majorHAnsi" w:cstheme="majorHAnsi"/>
-          <w:b/>
-          <w:bCs/>
-          <w:lang w:val="en-US"/>
-        </w:rPr>
-        <w:t>là</w:t>
-      </w:r>
-      <w:proofErr w:type="spellEnd"/>
-      <w:r>
-        <w:rPr>
-          <w:rFonts w:asciiTheme="majorHAnsi" w:hAnsiTheme="majorHAnsi" w:cstheme="majorHAnsi"/>
-          <w:b/>
-          <w:bCs/>
-          <w:lang w:val="en-US"/>
-        </w:rPr>
-        <w:t xml:space="preserve"> </w:t>
-      </w:r>
-      <w:proofErr w:type="spellStart"/>
-      <w:proofErr w:type="gramStart"/>
-      <w:r>
-        <w:rPr>
-          <w:rFonts w:asciiTheme="majorHAnsi" w:hAnsiTheme="majorHAnsi" w:cstheme="majorHAnsi"/>
-          <w:b/>
-          <w:bCs/>
-          <w:lang w:val="en-US"/>
-        </w:rPr>
-        <w:t>gì</w:t>
-      </w:r>
-      <w:proofErr w:type="spellEnd"/>
-      <w:r>
-        <w:rPr>
-          <w:rFonts w:asciiTheme="majorHAnsi" w:hAnsiTheme="majorHAnsi" w:cstheme="majorHAnsi"/>
-          <w:b/>
-          <w:bCs/>
-          <w:lang w:val="en-US"/>
-        </w:rPr>
-        <w:t xml:space="preserve"> ?</w:t>
-      </w:r>
-      <w:proofErr w:type="gramEnd"/>
-      <w:r>
-        <w:rPr>
-          <w:rFonts w:asciiTheme="majorHAnsi" w:hAnsiTheme="majorHAnsi" w:cstheme="majorHAnsi"/>
-          <w:b/>
-          <w:bCs/>
-          <w:lang w:val="en-US"/>
-        </w:rPr>
-        <w:t xml:space="preserve"> </w:t>
-      </w:r>
-      <w:r>
-        <w:rPr>
-          <w:rFonts w:asciiTheme="majorHAnsi" w:hAnsiTheme="majorHAnsi" w:cstheme="majorHAnsi"/>
-          <w:b/>
-          <w:bCs/>
-          <w:lang w:val="en-US"/>
-        </w:rPr>
-        <w:br/>
-      </w:r>
-      <w:r>
-        <w:rPr>
-          <w:rFonts w:asciiTheme="majorHAnsi" w:eastAsia="Times New Roman" w:hAnsiTheme="majorHAnsi" w:cstheme="majorHAnsi"/>
-          <w:b/>
-          <w:bCs/>
-          <w:kern w:val="0"/>
-          <w:lang w:eastAsia="vi-VN"/>
-          <w14:ligatures w14:val="none"/>
-        </w:rPr>
-        <w:t>Spring Framework</w:t>
-      </w:r>
-      <w:r>
-        <w:rPr>
-          <w:rFonts w:asciiTheme="majorHAnsi" w:eastAsia="Times New Roman" w:hAnsiTheme="majorHAnsi" w:cstheme="majorHAnsi"/>
-          <w:kern w:val="0"/>
-          <w:lang w:eastAsia="vi-VN"/>
-          <w14:ligatures w14:val="none"/>
-        </w:rPr>
-        <w:t xml:space="preserve"> là một hệ sinh thái (framework) mã nguồn mở cực kỳ phổ biến để phát triển các ứng dụng Java Enterprise. Nó cung cấp một hạ tầng toàn diện giúp lập trình viên giải quyết các vấn đề phức tạp trong phát triển phần mềm, từ việc quản lý các đối tượng đến kết nối cơ sở dữ liệu và bảo mật.</w:t>
-      </w:r>
-    </w:p>
-    <w:p>
-      <w:pPr>
-        <w:spacing w:before="100" w:beforeAutospacing="1" w:after="100" w:afterAutospacing="1" w:line="240" w:lineRule="auto"/>
-        <w:rPr>
-          <w:rFonts w:asciiTheme="majorHAnsi" w:eastAsia="Times New Roman" w:hAnsiTheme="majorHAnsi" w:cstheme="majorHAnsi"/>
-          <w:kern w:val="0"/>
-          <w:sz w:val="24"/>
-          <w:szCs w:val="24"/>
-          <w:lang w:eastAsia="vi-VN"/>
-          <w14:ligatures w14:val="none"/>
-        </w:rPr>
-      </w:pPr>
-      <w:r>
-        <w:rPr>
-          <w:rFonts w:asciiTheme="majorHAnsi" w:eastAsia="Times New Roman" w:hAnsiTheme="majorHAnsi" w:cstheme="majorHAnsi"/>
-          <w:kern w:val="0"/>
-          <w:sz w:val="24"/>
-          <w:szCs w:val="24"/>
-          <w:lang w:eastAsia="vi-VN"/>
-          <w14:ligatures w14:val="none"/>
-        </w:rPr>
-        <w:t>Hai khái niệm cốt lõi tạo nên sức mạnh của Spring là:</w:t>
-      </w:r>
-    </w:p>
-    <w:p>
-      <w:pPr>
-        <w:numPr>
-          <w:ilvl w:val="0"/>
-          <w:numId w:val="8"/>
-        </w:numPr>
-        <w:spacing w:before="100" w:beforeAutospacing="1" w:after="100" w:afterAutospacing="1" w:line="240" w:lineRule="auto"/>
-        <w:rPr>
-          <w:rFonts w:asciiTheme="majorHAnsi" w:eastAsia="Times New Roman" w:hAnsiTheme="majorHAnsi" w:cstheme="majorHAnsi"/>
-          <w:kern w:val="0"/>
-          <w:sz w:val="24"/>
-          <w:szCs w:val="24"/>
-          <w:lang w:eastAsia="vi-VN"/>
-          <w14:ligatures w14:val="none"/>
-        </w:rPr>
-      </w:pPr>
-      <w:r>
-        <w:rPr>
-          <w:rFonts w:asciiTheme="majorHAnsi" w:eastAsia="Times New Roman" w:hAnsiTheme="majorHAnsi" w:cstheme="majorHAnsi"/>
-          <w:b/>
-          <w:bCs/>
-          <w:kern w:val="0"/>
-          <w:sz w:val="24"/>
-          <w:szCs w:val="24"/>
-          <w:lang w:eastAsia="vi-VN"/>
-          <w14:ligatures w14:val="none"/>
-        </w:rPr>
-        <w:t>Inversion of Control (IoC):</w:t>
-      </w:r>
-      <w:r>
-        <w:rPr>
-          <w:rFonts w:asciiTheme="majorHAnsi" w:eastAsia="Times New Roman" w:hAnsiTheme="majorHAnsi" w:cstheme="majorHAnsi"/>
-          <w:kern w:val="0"/>
-          <w:sz w:val="24"/>
-          <w:szCs w:val="24"/>
-          <w:lang w:eastAsia="vi-VN"/>
-          <w14:ligatures w14:val="none"/>
-        </w:rPr>
-        <w:t xml:space="preserve"> Thay vì bạn tự khởi tạo đối tượng (ví dụ: new MyService()), Spring sẽ đứng ra quản lý và khởi tạo chúng giúp bạn.</w:t>
-      </w:r>
-    </w:p>
-    <w:p>
-      <w:pPr>
-        <w:numPr>
-          <w:ilvl w:val="0"/>
-          <w:numId w:val="8"/>
-        </w:numPr>
-        <w:spacing w:before="100" w:beforeAutospacing="1" w:after="100" w:afterAutospacing="1" w:line="240" w:lineRule="auto"/>
-        <w:rPr>
-          <w:rFonts w:asciiTheme="majorHAnsi" w:eastAsia="Times New Roman" w:hAnsiTheme="majorHAnsi" w:cstheme="majorHAnsi"/>
-          <w:kern w:val="0"/>
-          <w:sz w:val="24"/>
-          <w:szCs w:val="24"/>
-          <w:lang w:eastAsia="vi-VN"/>
-          <w14:ligatures w14:val="none"/>
-        </w:rPr>
-      </w:pPr>
-      <w:r>
-        <w:rPr>
-          <w:rFonts w:asciiTheme="majorHAnsi" w:eastAsia="Times New Roman" w:hAnsiTheme="majorHAnsi" w:cstheme="majorHAnsi"/>
-          <w:b/>
-          <w:bCs/>
-          <w:kern w:val="0"/>
-          <w:sz w:val="24"/>
-          <w:szCs w:val="24"/>
-          <w:lang w:eastAsia="vi-VN"/>
-          <w14:ligatures w14:val="none"/>
-        </w:rPr>
-        <w:t>Dependency Injection (DI):</w:t>
-      </w:r>
-      <w:r>
-        <w:rPr>
-          <w:rFonts w:asciiTheme="majorHAnsi" w:eastAsia="Times New Roman" w:hAnsiTheme="majorHAnsi" w:cstheme="majorHAnsi"/>
-          <w:kern w:val="0"/>
-          <w:sz w:val="24"/>
-          <w:szCs w:val="24"/>
-          <w:lang w:eastAsia="vi-VN"/>
-          <w14:ligatures w14:val="none"/>
-        </w:rPr>
-        <w:t xml:space="preserve"> Spring tự động "tiêm" các thành phần cần thiết vào một lớp để nó hoạt động, giúp mã nguồn linh hoạt và dễ kiểm thử (test) hơn.</w:t>
-      </w:r>
-    </w:p>
-    <w:p>
-      <w:pPr>
-        <w:pStyle w:val="NormalWeb"/>
-        <w:rPr>
-          <w:rFonts w:asciiTheme="majorHAnsi" w:eastAsia="Times New Roman" w:hAnsiTheme="majorHAnsi" w:cstheme="majorHAnsi"/>
-          <w:kern w:val="0"/>
-          <w:lang w:eastAsia="vi-VN"/>
-          <w14:ligatures w14:val="none"/>
-        </w:rPr>
-      </w:pPr>
-      <w:r>
-        <w:rPr>
-          <w:rFonts w:asciiTheme="majorHAnsi" w:hAnsiTheme="majorHAnsi" w:cstheme="majorHAnsi"/>
-          <w:b/>
-          <w:bCs/>
-          <w:lang w:val="en-US"/>
-        </w:rPr>
-        <w:t>Spring Boot</w:t>
-      </w:r>
-      <w:r>
-        <w:rPr>
-          <w:rFonts w:asciiTheme="majorHAnsi" w:hAnsiTheme="majorHAnsi" w:cstheme="majorHAnsi"/>
-          <w:b/>
-          <w:bCs/>
-          <w:lang w:val="en-US"/>
-        </w:rPr>
-        <w:t xml:space="preserve"> </w:t>
-      </w:r>
-      <w:proofErr w:type="spellStart"/>
-      <w:r>
-        <w:rPr>
-          <w:rFonts w:asciiTheme="majorHAnsi" w:hAnsiTheme="majorHAnsi" w:cstheme="majorHAnsi"/>
-          <w:b/>
-          <w:bCs/>
-          <w:lang w:val="en-US"/>
-        </w:rPr>
-        <w:t>là</w:t>
-      </w:r>
-      <w:proofErr w:type="spellEnd"/>
-      <w:r>
-        <w:rPr>
-          <w:rFonts w:asciiTheme="majorHAnsi" w:hAnsiTheme="majorHAnsi" w:cstheme="majorHAnsi"/>
-          <w:b/>
-          <w:bCs/>
-          <w:lang w:val="en-US"/>
-        </w:rPr>
-        <w:t xml:space="preserve"> </w:t>
-      </w:r>
-      <w:proofErr w:type="spellStart"/>
-      <w:r>
-        <w:rPr>
-          <w:rFonts w:asciiTheme="majorHAnsi" w:hAnsiTheme="majorHAnsi" w:cstheme="majorHAnsi"/>
-          <w:b/>
-          <w:bCs/>
-          <w:lang w:val="en-US"/>
-        </w:rPr>
-        <w:t>gì</w:t>
-      </w:r>
-      <w:proofErr w:type="spellEnd"/>
-      <w:r>
-        <w:rPr>
-          <w:rFonts w:asciiTheme="majorHAnsi" w:hAnsiTheme="majorHAnsi" w:cstheme="majorHAnsi"/>
-          <w:b/>
-          <w:bCs/>
-          <w:lang w:val="en-US"/>
-        </w:rPr>
-        <w:t xml:space="preserve"> </w:t>
-      </w:r>
-      <w:r>
-        <w:rPr>
-          <w:rFonts w:asciiTheme="majorHAnsi" w:hAnsiTheme="majorHAnsi" w:cstheme="majorHAnsi"/>
-          <w:lang w:val="en-US"/>
-        </w:rPr>
-        <w:br/>
-      </w:r>
-      <w:r>
-        <w:rPr>
-          <w:rFonts w:asciiTheme="majorHAnsi" w:eastAsia="Times New Roman" w:hAnsiTheme="majorHAnsi" w:cstheme="majorHAnsi"/>
-          <w:kern w:val="0"/>
-          <w:lang w:eastAsia="vi-VN"/>
-          <w14:ligatures w14:val="none"/>
-        </w:rPr>
-        <w:t xml:space="preserve">Nếu Spring Framework giống như một bộ linh kiện máy tính rời rạc (bạn phải tự lắp ráp, cấu hình từng chút một), thì </w:t>
-      </w:r>
-      <w:r>
-        <w:rPr>
-          <w:rFonts w:asciiTheme="majorHAnsi" w:eastAsia="Times New Roman" w:hAnsiTheme="majorHAnsi" w:cstheme="majorHAnsi"/>
-          <w:b/>
-          <w:bCs/>
-          <w:kern w:val="0"/>
-          <w:lang w:eastAsia="vi-VN"/>
-          <w14:ligatures w14:val="none"/>
-        </w:rPr>
-        <w:t>Spring Boot</w:t>
-      </w:r>
-      <w:r>
-        <w:rPr>
-          <w:rFonts w:asciiTheme="majorHAnsi" w:eastAsia="Times New Roman" w:hAnsiTheme="majorHAnsi" w:cstheme="majorHAnsi"/>
-          <w:kern w:val="0"/>
-          <w:lang w:eastAsia="vi-VN"/>
-          <w14:ligatures w14:val="none"/>
-        </w:rPr>
-        <w:t xml:space="preserve"> chính là một chiếc máy tính đã được lắp sẵn và cài đặt mọi thứ, chỉ cần "bật nguồn" là chạy.</w:t>
-      </w:r>
-    </w:p>
-    <w:p>
-      <w:pPr>
-        <w:spacing w:before="100" w:beforeAutospacing="1" w:after="100" w:afterAutospacing="1" w:line="240" w:lineRule="auto"/>
-        <w:rPr>
-          <w:rFonts w:asciiTheme="majorHAnsi" w:eastAsia="Times New Roman" w:hAnsiTheme="majorHAnsi" w:cstheme="majorHAnsi"/>
-          <w:kern w:val="0"/>
-          <w:sz w:val="24"/>
-          <w:szCs w:val="24"/>
-          <w:lang w:eastAsia="vi-VN"/>
-          <w14:ligatures w14:val="none"/>
-        </w:rPr>
-      </w:pPr>
-      <w:r>
-        <w:rPr>
-          <w:rFonts w:asciiTheme="majorHAnsi" w:eastAsia="Times New Roman" w:hAnsiTheme="majorHAnsi" w:cstheme="majorHAnsi"/>
-          <w:b/>
-          <w:bCs/>
-          <w:kern w:val="0"/>
-          <w:sz w:val="24"/>
-          <w:szCs w:val="24"/>
-          <w:lang w:eastAsia="vi-VN"/>
-          <w14:ligatures w14:val="none"/>
-        </w:rPr>
-        <w:t>Spring Boot</w:t>
-      </w:r>
-      <w:r>
-        <w:rPr>
-          <w:rFonts w:asciiTheme="majorHAnsi" w:eastAsia="Times New Roman" w:hAnsiTheme="majorHAnsi" w:cstheme="majorHAnsi"/>
-          <w:kern w:val="0"/>
-          <w:sz w:val="24"/>
-          <w:szCs w:val="24"/>
-          <w:lang w:eastAsia="vi-VN"/>
-          <w14:ligatures w14:val="none"/>
-        </w:rPr>
-        <w:t xml:space="preserve"> được xây dựng dựa trên nền tảng Spring Framework nhưng tập trung vào sự tối giản và nhanh chóng. Mục tiêu của nó là giúp bạn tạo ra một ứng dụng có thể chạy ngay lập tức (Ready to run) mà không mất quá nhiều thời gian cấu hình.</w:t>
-      </w:r>
-    </w:p>
-    <w:p>
-      <w:pPr>
-        <w:spacing w:before="100" w:beforeAutospacing="1" w:after="100" w:afterAutospacing="1" w:line="240" w:lineRule="auto"/>
-        <w:outlineLvl w:val="2"/>
-        <w:rPr>
-          <w:rFonts w:asciiTheme="majorHAnsi" w:eastAsia="Times New Roman" w:hAnsiTheme="majorHAnsi" w:cstheme="majorHAnsi"/>
-          <w:b/>
-          <w:bCs/>
-          <w:kern w:val="0"/>
-          <w:sz w:val="24"/>
-          <w:szCs w:val="24"/>
-          <w:lang w:eastAsia="vi-VN"/>
-          <w14:ligatures w14:val="none"/>
-        </w:rPr>
-      </w:pPr>
-      <w:r>
-        <w:rPr>
-          <w:rFonts w:asciiTheme="majorHAnsi" w:eastAsia="Times New Roman" w:hAnsiTheme="majorHAnsi" w:cstheme="majorHAnsi"/>
-          <w:b/>
-          <w:bCs/>
-          <w:kern w:val="0"/>
-          <w:sz w:val="24"/>
-          <w:szCs w:val="24"/>
-          <w:lang w:eastAsia="vi-VN"/>
-          <w14:ligatures w14:val="none"/>
-        </w:rPr>
-        <w:t>Đặc điểm nổi bật của Spring Boot:</w:t>
-      </w:r>
-    </w:p>
-    <w:p>
-      <w:pPr>
-        <w:numPr>
-          <w:ilvl w:val="0"/>
-          <w:numId w:val="9"/>
-        </w:numPr>
-        <w:spacing w:before="100" w:beforeAutospacing="1" w:after="100" w:afterAutospacing="1" w:line="240" w:lineRule="auto"/>
-        <w:rPr>
-          <w:rFonts w:asciiTheme="majorHAnsi" w:eastAsia="Times New Roman" w:hAnsiTheme="majorHAnsi" w:cstheme="majorHAnsi"/>
-          <w:kern w:val="0"/>
-          <w:sz w:val="24"/>
-          <w:szCs w:val="24"/>
-          <w:lang w:eastAsia="vi-VN"/>
-          <w14:ligatures w14:val="none"/>
-        </w:rPr>
-      </w:pPr>
-      <w:r>
-        <w:rPr>
-          <w:rFonts w:asciiTheme="majorHAnsi" w:eastAsia="Times New Roman" w:hAnsiTheme="majorHAnsi" w:cstheme="majorHAnsi"/>
-          <w:b/>
-          <w:bCs/>
-          <w:kern w:val="0"/>
-          <w:sz w:val="24"/>
-          <w:szCs w:val="24"/>
-          <w:lang w:eastAsia="vi-VN"/>
-          <w14:ligatures w14:val="none"/>
-        </w:rPr>
-        <w:t>Auto-configuration:</w:t>
-      </w:r>
-      <w:r>
-        <w:rPr>
-          <w:rFonts w:asciiTheme="majorHAnsi" w:eastAsia="Times New Roman" w:hAnsiTheme="majorHAnsi" w:cstheme="majorHAnsi"/>
-          <w:kern w:val="0"/>
-          <w:sz w:val="24"/>
-          <w:szCs w:val="24"/>
-          <w:lang w:eastAsia="vi-VN"/>
-          <w14:ligatures w14:val="none"/>
-        </w:rPr>
-        <w:t xml:space="preserve"> Tự động cấu hình các thư viện dựa trên những gì bạn thêm vào dự án.</w:t>
-      </w:r>
-    </w:p>
-    <w:p>
-      <w:pPr>
-        <w:numPr>
-          <w:ilvl w:val="0"/>
-          <w:numId w:val="9"/>
-        </w:numPr>
-        <w:spacing w:before="100" w:beforeAutospacing="1" w:after="100" w:afterAutospacing="1" w:line="240" w:lineRule="auto"/>
-        <w:rPr>
-          <w:rFonts w:asciiTheme="majorHAnsi" w:eastAsia="Times New Roman" w:hAnsiTheme="majorHAnsi" w:cstheme="majorHAnsi"/>
-          <w:kern w:val="0"/>
-          <w:sz w:val="24"/>
-          <w:szCs w:val="24"/>
-          <w:lang w:eastAsia="vi-VN"/>
-          <w14:ligatures w14:val="none"/>
-        </w:rPr>
-      </w:pPr>
-      <w:r>
-        <w:rPr>
-          <w:rFonts w:asciiTheme="majorHAnsi" w:eastAsia="Times New Roman" w:hAnsiTheme="majorHAnsi" w:cstheme="majorHAnsi"/>
-          <w:b/>
-          <w:bCs/>
-          <w:kern w:val="0"/>
-          <w:sz w:val="24"/>
-          <w:szCs w:val="24"/>
-          <w:lang w:eastAsia="vi-VN"/>
-          <w14:ligatures w14:val="none"/>
-        </w:rPr>
-        <w:t>Embedded Server:</w:t>
-      </w:r>
-      <w:r>
-        <w:rPr>
-          <w:rFonts w:asciiTheme="majorHAnsi" w:eastAsia="Times New Roman" w:hAnsiTheme="majorHAnsi" w:cstheme="majorHAnsi"/>
-          <w:kern w:val="0"/>
-          <w:sz w:val="24"/>
-          <w:szCs w:val="24"/>
-          <w:lang w:eastAsia="vi-VN"/>
-          <w14:ligatures w14:val="none"/>
-        </w:rPr>
-        <w:t xml:space="preserve"> Tích hợp sẵn Server (như Tomcat) bên trong. Bạn không cần cài đặt Server riêng lẻ; ứng dụng sẽ chạy như một file Java thông thường.</w:t>
-      </w:r>
-    </w:p>
-    <w:p>
-      <w:pPr>
-        <w:numPr>
-          <w:ilvl w:val="0"/>
-          <w:numId w:val="9"/>
-        </w:numPr>
-        <w:spacing w:before="100" w:beforeAutospacing="1" w:after="100" w:afterAutospacing="1" w:line="240" w:lineRule="auto"/>
-        <w:rPr>
-          <w:rFonts w:asciiTheme="majorHAnsi" w:eastAsia="Times New Roman" w:hAnsiTheme="majorHAnsi" w:cstheme="majorHAnsi"/>
-          <w:kern w:val="0"/>
-          <w:sz w:val="24"/>
-          <w:szCs w:val="24"/>
-          <w:lang w:eastAsia="vi-VN"/>
-          <w14:ligatures w14:val="none"/>
-        </w:rPr>
-      </w:pPr>
-      <w:r>
-        <w:rPr>
-          <w:rFonts w:asciiTheme="majorHAnsi" w:eastAsia="Times New Roman" w:hAnsiTheme="majorHAnsi" w:cstheme="majorHAnsi"/>
-          <w:b/>
-          <w:bCs/>
-          <w:kern w:val="0"/>
-          <w:sz w:val="24"/>
-          <w:szCs w:val="24"/>
-          <w:lang w:eastAsia="vi-VN"/>
-          <w14:ligatures w14:val="none"/>
-        </w:rPr>
-        <w:t>Starter Dependencies:</w:t>
-      </w:r>
-      <w:r>
-        <w:rPr>
-          <w:rFonts w:asciiTheme="majorHAnsi" w:eastAsia="Times New Roman" w:hAnsiTheme="majorHAnsi" w:cstheme="majorHAnsi"/>
-          <w:kern w:val="0"/>
-          <w:sz w:val="24"/>
-          <w:szCs w:val="24"/>
-          <w:lang w:eastAsia="vi-VN"/>
-          <w14:ligatures w14:val="none"/>
-        </w:rPr>
-        <w:t xml:space="preserve"> Cung cấp các gói thư viện "mồi" (Starters) để gom nhóm các công nghệ liên quan (ví dụ: spring-boot-starter-web sẽ tự động tải về mọi thứ cần để làm website).</w:t>
-      </w:r>
-    </w:p>
-    <w:p>
-      <w:pPr>
-        <w:pStyle w:val="NormalWeb"/>
-        <w:rPr>
-          <w:rFonts w:asciiTheme="majorHAnsi" w:hAnsiTheme="majorHAnsi" w:cstheme="majorHAnsi"/>
-          <w:b/>
-          <w:bCs/>
-          <w:lang w:val="en-US"/>
-        </w:rPr>
-      </w:pPr>
-    </w:p>
-    <w:p>
-      <w:pPr>
-        <w:rPr>
-          <w:rFonts w:asciiTheme="majorHAnsi" w:hAnsiTheme="majorHAnsi" w:cstheme="majorHAnsi"/>
-          <w:b/>
-          <w:bCs/>
-          <w:sz w:val="24"/>
-          <w:szCs w:val="24"/>
-          <w:lang w:val="en-US"/>
-        </w:rPr>
-      </w:pPr>
-      <w:r>
-        <w:rPr>
-          <w:rFonts w:asciiTheme="majorHAnsi" w:hAnsiTheme="majorHAnsi" w:cstheme="majorHAnsi"/>
-          <w:b/>
-          <w:bCs/>
-          <w:sz w:val="24"/>
-          <w:szCs w:val="24"/>
-          <w:lang w:val="en-US"/>
-        </w:rPr>
-        <w:br w:type="page"/>
-      </w:r>
-    </w:p>
-    <w:p>
-      <w:pPr>
-        <w:rPr>
-          <w:rFonts w:asciiTheme="majorHAnsi" w:hAnsiTheme="majorHAnsi" w:cstheme="majorHAnsi"/>
-          <w:b/>
-          <w:bCs/>
-          <w:sz w:val="24"/>
-          <w:szCs w:val="24"/>
-          <w:lang w:val="en-US"/>
-        </w:rPr>
-      </w:pPr>
-      <w:r>
-        <w:rPr>
-          <w:rFonts w:asciiTheme="majorHAnsi" w:hAnsiTheme="majorHAnsi" w:cstheme="majorHAnsi"/>
-          <w:b/>
-          <w:bCs/>
-          <w:sz w:val="24"/>
-          <w:szCs w:val="24"/>
-          <w:lang w:val="en-US"/>
-        </w:rPr>
-        <w:lastRenderedPageBreak/>
-        <w:t xml:space="preserve">Git </w:t>
-      </w:r>
-      <w:proofErr w:type="spellStart"/>
-      <w:r>
-        <w:rPr>
-          <w:rFonts w:asciiTheme="majorHAnsi" w:hAnsiTheme="majorHAnsi" w:cstheme="majorHAnsi"/>
-          <w:b/>
-          <w:bCs/>
-          <w:sz w:val="24"/>
-          <w:szCs w:val="24"/>
-          <w:lang w:val="en-US"/>
-        </w:rPr>
-        <w:t>là</w:t>
-      </w:r>
-      <w:proofErr w:type="spellEnd"/>
-      <w:r>
-        <w:rPr>
-          <w:rFonts w:asciiTheme="majorHAnsi" w:hAnsiTheme="majorHAnsi" w:cstheme="majorHAnsi"/>
-          <w:b/>
-          <w:bCs/>
-          <w:sz w:val="24"/>
-          <w:szCs w:val="24"/>
-          <w:lang w:val="en-US"/>
-        </w:rPr>
-        <w:t xml:space="preserve"> </w:t>
-      </w:r>
-      <w:proofErr w:type="spellStart"/>
-      <w:r>
-        <w:rPr>
-          <w:rFonts w:asciiTheme="majorHAnsi" w:hAnsiTheme="majorHAnsi" w:cstheme="majorHAnsi"/>
-          <w:b/>
-          <w:bCs/>
-          <w:sz w:val="24"/>
-          <w:szCs w:val="24"/>
-          <w:lang w:val="en-US"/>
-        </w:rPr>
-        <w:t>gì</w:t>
-      </w:r>
-      <w:proofErr w:type="spellEnd"/>
-      <w:r>
-        <w:rPr>
-          <w:rFonts w:asciiTheme="majorHAnsi" w:hAnsiTheme="majorHAnsi" w:cstheme="majorHAnsi"/>
-          <w:b/>
-          <w:bCs/>
-          <w:sz w:val="24"/>
-          <w:szCs w:val="24"/>
-          <w:lang w:val="en-US"/>
-        </w:rPr>
-        <w:t xml:space="preserve">, </w:t>
-      </w:r>
-      <w:proofErr w:type="spellStart"/>
-      <w:r>
-        <w:rPr>
-          <w:rFonts w:asciiTheme="majorHAnsi" w:hAnsiTheme="majorHAnsi" w:cstheme="majorHAnsi"/>
-          <w:b/>
-          <w:bCs/>
-          <w:sz w:val="24"/>
-          <w:szCs w:val="24"/>
-          <w:lang w:val="en-US"/>
-        </w:rPr>
-        <w:t>ưu</w:t>
-      </w:r>
-      <w:proofErr w:type="spellEnd"/>
-      <w:r>
-        <w:rPr>
-          <w:rFonts w:asciiTheme="majorHAnsi" w:hAnsiTheme="majorHAnsi" w:cstheme="majorHAnsi"/>
-          <w:b/>
-          <w:bCs/>
-          <w:sz w:val="24"/>
-          <w:szCs w:val="24"/>
-          <w:lang w:val="en-US"/>
-        </w:rPr>
-        <w:t xml:space="preserve"> </w:t>
-      </w:r>
-      <w:proofErr w:type="spellStart"/>
-      <w:r>
-        <w:rPr>
-          <w:rFonts w:asciiTheme="majorHAnsi" w:hAnsiTheme="majorHAnsi" w:cstheme="majorHAnsi"/>
-          <w:b/>
-          <w:bCs/>
-          <w:sz w:val="24"/>
-          <w:szCs w:val="24"/>
-          <w:lang w:val="en-US"/>
-        </w:rPr>
-        <w:t>điểm</w:t>
-      </w:r>
-      <w:proofErr w:type="spellEnd"/>
-      <w:r>
-        <w:rPr>
-          <w:rFonts w:asciiTheme="majorHAnsi" w:hAnsiTheme="majorHAnsi" w:cstheme="majorHAnsi"/>
-          <w:b/>
-          <w:bCs/>
-          <w:sz w:val="24"/>
-          <w:szCs w:val="24"/>
-          <w:lang w:val="en-US"/>
-        </w:rPr>
-        <w:t xml:space="preserve">. </w:t>
-      </w:r>
-      <w:proofErr w:type="spellStart"/>
-      <w:r>
-        <w:rPr>
-          <w:rFonts w:asciiTheme="majorHAnsi" w:hAnsiTheme="majorHAnsi" w:cstheme="majorHAnsi"/>
-          <w:b/>
-          <w:bCs/>
-          <w:sz w:val="24"/>
-          <w:szCs w:val="24"/>
-          <w:lang w:val="en-US"/>
-        </w:rPr>
-        <w:t>Một</w:t>
-      </w:r>
-      <w:proofErr w:type="spellEnd"/>
-      <w:r>
-        <w:rPr>
-          <w:rFonts w:asciiTheme="majorHAnsi" w:hAnsiTheme="majorHAnsi" w:cstheme="majorHAnsi"/>
-          <w:b/>
-          <w:bCs/>
-          <w:sz w:val="24"/>
-          <w:szCs w:val="24"/>
-          <w:lang w:val="en-US"/>
-        </w:rPr>
-        <w:t xml:space="preserve"> </w:t>
-      </w:r>
-      <w:proofErr w:type="spellStart"/>
-      <w:r>
-        <w:rPr>
-          <w:rFonts w:asciiTheme="majorHAnsi" w:hAnsiTheme="majorHAnsi" w:cstheme="majorHAnsi"/>
-          <w:b/>
-          <w:bCs/>
-          <w:sz w:val="24"/>
-          <w:szCs w:val="24"/>
-          <w:lang w:val="en-US"/>
-        </w:rPr>
-        <w:t>số</w:t>
-      </w:r>
-      <w:proofErr w:type="spellEnd"/>
-      <w:r>
-        <w:rPr>
-          <w:rFonts w:asciiTheme="majorHAnsi" w:hAnsiTheme="majorHAnsi" w:cstheme="majorHAnsi"/>
-          <w:b/>
-          <w:bCs/>
-          <w:sz w:val="24"/>
-          <w:szCs w:val="24"/>
-          <w:lang w:val="en-US"/>
-        </w:rPr>
-        <w:t xml:space="preserve"> </w:t>
-      </w:r>
-      <w:proofErr w:type="spellStart"/>
-      <w:r>
-        <w:rPr>
-          <w:rFonts w:asciiTheme="majorHAnsi" w:hAnsiTheme="majorHAnsi" w:cstheme="majorHAnsi"/>
-          <w:b/>
-          <w:bCs/>
-          <w:sz w:val="24"/>
-          <w:szCs w:val="24"/>
-          <w:lang w:val="en-US"/>
-        </w:rPr>
-        <w:t>lệnh</w:t>
-      </w:r>
-      <w:proofErr w:type="spellEnd"/>
-      <w:r>
-        <w:rPr>
-          <w:rFonts w:asciiTheme="majorHAnsi" w:hAnsiTheme="majorHAnsi" w:cstheme="majorHAnsi"/>
-          <w:b/>
-          <w:bCs/>
-          <w:sz w:val="24"/>
-          <w:szCs w:val="24"/>
-          <w:lang w:val="en-US"/>
-        </w:rPr>
-        <w:t xml:space="preserve"> </w:t>
-      </w:r>
-      <w:proofErr w:type="spellStart"/>
-      <w:r>
-        <w:rPr>
-          <w:rFonts w:asciiTheme="majorHAnsi" w:hAnsiTheme="majorHAnsi" w:cstheme="majorHAnsi"/>
-          <w:b/>
-          <w:bCs/>
-          <w:sz w:val="24"/>
-          <w:szCs w:val="24"/>
-          <w:lang w:val="en-US"/>
-        </w:rPr>
-        <w:t>cơ</w:t>
-      </w:r>
-      <w:proofErr w:type="spellEnd"/>
-      <w:r>
-        <w:rPr>
-          <w:rFonts w:asciiTheme="majorHAnsi" w:hAnsiTheme="majorHAnsi" w:cstheme="majorHAnsi"/>
-          <w:b/>
-          <w:bCs/>
-          <w:sz w:val="24"/>
-          <w:szCs w:val="24"/>
-          <w:lang w:val="en-US"/>
-        </w:rPr>
-        <w:t xml:space="preserve"> </w:t>
-      </w:r>
-      <w:proofErr w:type="spellStart"/>
-      <w:r>
-        <w:rPr>
-          <w:rFonts w:asciiTheme="majorHAnsi" w:hAnsiTheme="majorHAnsi" w:cstheme="majorHAnsi"/>
-          <w:b/>
-          <w:bCs/>
-          <w:sz w:val="24"/>
-          <w:szCs w:val="24"/>
-          <w:lang w:val="en-US"/>
-        </w:rPr>
-        <w:t>bản</w:t>
-      </w:r>
-      <w:proofErr w:type="spellEnd"/>
-      <w:r>
-        <w:rPr>
-          <w:rFonts w:asciiTheme="majorHAnsi" w:hAnsiTheme="majorHAnsi" w:cstheme="majorHAnsi"/>
-          <w:b/>
-          <w:bCs/>
-          <w:sz w:val="24"/>
-          <w:szCs w:val="24"/>
-          <w:lang w:val="en-US"/>
-        </w:rPr>
-        <w:t xml:space="preserve"> </w:t>
-      </w:r>
-      <w:proofErr w:type="spellStart"/>
-      <w:r>
-        <w:rPr>
-          <w:rFonts w:asciiTheme="majorHAnsi" w:hAnsiTheme="majorHAnsi" w:cstheme="majorHAnsi"/>
-          <w:b/>
-          <w:bCs/>
-          <w:sz w:val="24"/>
-          <w:szCs w:val="24"/>
-          <w:lang w:val="en-US"/>
-        </w:rPr>
-        <w:t>trong</w:t>
-      </w:r>
-      <w:proofErr w:type="spellEnd"/>
-      <w:r>
-        <w:rPr>
-          <w:rFonts w:asciiTheme="majorHAnsi" w:hAnsiTheme="majorHAnsi" w:cstheme="majorHAnsi"/>
-          <w:b/>
-          <w:bCs/>
-          <w:sz w:val="24"/>
-          <w:szCs w:val="24"/>
-          <w:lang w:val="en-US"/>
-        </w:rPr>
-        <w:t xml:space="preserve"> Git </w:t>
-      </w:r>
-      <w:r>
-        <w:rPr>
-          <w:rFonts w:asciiTheme="majorHAnsi" w:hAnsiTheme="majorHAnsi" w:cstheme="majorHAnsi"/>
-          <w:b/>
-          <w:bCs/>
-          <w:sz w:val="24"/>
-          <w:szCs w:val="24"/>
-          <w:lang w:val="en-US"/>
-        </w:rPr>
-        <w:br/>
-      </w:r>
-      <w:r>
-        <w:rPr>
-          <w:rFonts w:asciiTheme="majorHAnsi" w:eastAsia="Times New Roman" w:hAnsiTheme="majorHAnsi" w:cstheme="majorHAnsi"/>
-          <w:kern w:val="0"/>
-          <w:sz w:val="24"/>
-          <w:szCs w:val="24"/>
-          <w:lang w:eastAsia="vi-VN"/>
-          <w14:ligatures w14:val="none"/>
-        </w:rPr>
-        <w:t>Git là hệ thống quản lý phiên bản (Version Control System) dùng để theo dõi và quản lý thay đổi của source code.</w:t>
-      </w:r>
-    </w:p>
-    <w:p>
-      <w:pPr>
-        <w:spacing w:before="100" w:beforeAutospacing="1" w:after="100" w:afterAutospacing="1" w:line="240" w:lineRule="auto"/>
-        <w:rPr>
-          <w:rFonts w:asciiTheme="majorHAnsi" w:eastAsia="Times New Roman" w:hAnsiTheme="majorHAnsi" w:cstheme="majorHAnsi"/>
-          <w:kern w:val="0"/>
-          <w:sz w:val="24"/>
-          <w:szCs w:val="24"/>
-          <w:lang w:eastAsia="vi-VN"/>
-          <w14:ligatures w14:val="none"/>
-        </w:rPr>
-      </w:pPr>
-      <w:r>
-        <w:rPr>
-          <w:rFonts w:asciiTheme="majorHAnsi" w:eastAsia="Times New Roman" w:hAnsiTheme="majorHAnsi" w:cstheme="majorHAnsi"/>
-          <w:kern w:val="0"/>
-          <w:sz w:val="24"/>
-          <w:szCs w:val="24"/>
-          <w:lang w:eastAsia="vi-VN"/>
-          <w14:ligatures w14:val="none"/>
-        </w:rPr>
-        <w:t>Nó giúp:</w:t>
-      </w:r>
-    </w:p>
-    <w:p>
-      <w:pPr>
-        <w:numPr>
-          <w:ilvl w:val="0"/>
-          <w:numId w:val="3"/>
-        </w:numPr>
-        <w:spacing w:before="100" w:beforeAutospacing="1" w:after="100" w:afterAutospacing="1" w:line="240" w:lineRule="auto"/>
-        <w:rPr>
-          <w:rFonts w:asciiTheme="majorHAnsi" w:eastAsia="Times New Roman" w:hAnsiTheme="majorHAnsi" w:cstheme="majorHAnsi"/>
-          <w:kern w:val="0"/>
-          <w:sz w:val="24"/>
-          <w:szCs w:val="24"/>
-          <w:lang w:eastAsia="vi-VN"/>
-          <w14:ligatures w14:val="none"/>
-        </w:rPr>
-      </w:pPr>
-      <w:r>
-        <w:rPr>
-          <w:rFonts w:asciiTheme="majorHAnsi" w:eastAsia="Times New Roman" w:hAnsiTheme="majorHAnsi" w:cstheme="majorHAnsi"/>
-          <w:kern w:val="0"/>
-          <w:sz w:val="24"/>
-          <w:szCs w:val="24"/>
-          <w:lang w:eastAsia="vi-VN"/>
-          <w14:ligatures w14:val="none"/>
-        </w:rPr>
-        <w:t xml:space="preserve">Lưu lịch sử code </w:t>
-      </w:r>
-    </w:p>
-    <w:p>
-      <w:pPr>
-        <w:numPr>
-          <w:ilvl w:val="0"/>
-          <w:numId w:val="3"/>
-        </w:numPr>
-        <w:spacing w:before="100" w:beforeAutospacing="1" w:after="100" w:afterAutospacing="1" w:line="240" w:lineRule="auto"/>
-        <w:rPr>
-          <w:rFonts w:asciiTheme="majorHAnsi" w:eastAsia="Times New Roman" w:hAnsiTheme="majorHAnsi" w:cstheme="majorHAnsi"/>
-          <w:kern w:val="0"/>
-          <w:sz w:val="24"/>
-          <w:szCs w:val="24"/>
-          <w:lang w:eastAsia="vi-VN"/>
-          <w14:ligatures w14:val="none"/>
-        </w:rPr>
-      </w:pPr>
-      <w:r>
-        <w:rPr>
-          <w:rFonts w:asciiTheme="majorHAnsi" w:eastAsia="Times New Roman" w:hAnsiTheme="majorHAnsi" w:cstheme="majorHAnsi"/>
-          <w:kern w:val="0"/>
-          <w:sz w:val="24"/>
-          <w:szCs w:val="24"/>
-          <w:lang w:eastAsia="vi-VN"/>
-          <w14:ligatures w14:val="none"/>
-        </w:rPr>
-        <w:t xml:space="preserve">Quay lại phiên bản cũ </w:t>
-      </w:r>
-    </w:p>
-    <w:p>
-      <w:pPr>
-        <w:numPr>
-          <w:ilvl w:val="0"/>
-          <w:numId w:val="3"/>
-        </w:numPr>
-        <w:spacing w:before="100" w:beforeAutospacing="1" w:after="100" w:afterAutospacing="1" w:line="240" w:lineRule="auto"/>
-        <w:rPr>
-          <w:rFonts w:asciiTheme="majorHAnsi" w:eastAsia="Times New Roman" w:hAnsiTheme="majorHAnsi" w:cstheme="majorHAnsi"/>
-          <w:kern w:val="0"/>
-          <w:sz w:val="24"/>
-          <w:szCs w:val="24"/>
-          <w:lang w:eastAsia="vi-VN"/>
-          <w14:ligatures w14:val="none"/>
-        </w:rPr>
-      </w:pPr>
-      <w:r>
-        <w:rPr>
-          <w:rFonts w:asciiTheme="majorHAnsi" w:eastAsia="Times New Roman" w:hAnsiTheme="majorHAnsi" w:cstheme="majorHAnsi"/>
-          <w:kern w:val="0"/>
-          <w:sz w:val="24"/>
-          <w:szCs w:val="24"/>
-          <w:lang w:eastAsia="vi-VN"/>
-          <w14:ligatures w14:val="none"/>
-        </w:rPr>
-        <w:t xml:space="preserve">Làm việc nhóm </w:t>
-      </w:r>
-    </w:p>
-    <w:p>
-      <w:pPr>
-        <w:numPr>
-          <w:ilvl w:val="0"/>
-          <w:numId w:val="3"/>
-        </w:numPr>
-        <w:spacing w:before="100" w:beforeAutospacing="1" w:after="100" w:afterAutospacing="1" w:line="240" w:lineRule="auto"/>
-        <w:rPr>
-          <w:rFonts w:asciiTheme="majorHAnsi" w:eastAsia="Times New Roman" w:hAnsiTheme="majorHAnsi" w:cstheme="majorHAnsi"/>
-          <w:kern w:val="0"/>
-          <w:sz w:val="24"/>
-          <w:szCs w:val="24"/>
-          <w:lang w:eastAsia="vi-VN"/>
-          <w14:ligatures w14:val="none"/>
-        </w:rPr>
-      </w:pPr>
-      <w:r>
-        <w:rPr>
-          <w:rFonts w:asciiTheme="majorHAnsi" w:eastAsia="Times New Roman" w:hAnsiTheme="majorHAnsi" w:cstheme="majorHAnsi"/>
-          <w:kern w:val="0"/>
-          <w:sz w:val="24"/>
-          <w:szCs w:val="24"/>
-          <w:lang w:eastAsia="vi-VN"/>
-          <w14:ligatures w14:val="none"/>
-        </w:rPr>
-        <w:t xml:space="preserve">Merge code </w:t>
-      </w:r>
-    </w:p>
-    <w:p>
-      <w:pPr>
-        <w:numPr>
-          <w:ilvl w:val="0"/>
-          <w:numId w:val="3"/>
-        </w:numPr>
-        <w:spacing w:before="100" w:beforeAutospacing="1" w:after="100" w:afterAutospacing="1" w:line="240" w:lineRule="auto"/>
-        <w:rPr>
-          <w:rFonts w:asciiTheme="majorHAnsi" w:eastAsia="Times New Roman" w:hAnsiTheme="majorHAnsi" w:cstheme="majorHAnsi"/>
-          <w:kern w:val="0"/>
-          <w:sz w:val="24"/>
-          <w:szCs w:val="24"/>
-          <w:lang w:eastAsia="vi-VN"/>
-          <w14:ligatures w14:val="none"/>
-        </w:rPr>
-      </w:pPr>
-      <w:r>
-        <w:rPr>
-          <w:rFonts w:asciiTheme="majorHAnsi" w:eastAsia="Times New Roman" w:hAnsiTheme="majorHAnsi" w:cstheme="majorHAnsi"/>
-          <w:kern w:val="0"/>
-          <w:sz w:val="24"/>
-          <w:szCs w:val="24"/>
-          <w:lang w:eastAsia="vi-VN"/>
-          <w14:ligatures w14:val="none"/>
-        </w:rPr>
-        <w:t xml:space="preserve">Quản lý branch </w:t>
-      </w:r>
-    </w:p>
-    <w:p>
-      <w:pPr>
-        <w:spacing w:before="100" w:beforeAutospacing="1" w:after="100" w:afterAutospacing="1" w:line="240" w:lineRule="auto"/>
-        <w:rPr>
-          <w:rFonts w:asciiTheme="majorHAnsi" w:eastAsia="Times New Roman" w:hAnsiTheme="majorHAnsi" w:cstheme="majorHAnsi"/>
-          <w:kern w:val="0"/>
-          <w:sz w:val="24"/>
-          <w:szCs w:val="24"/>
-          <w:lang w:eastAsia="vi-VN"/>
-          <w14:ligatures w14:val="none"/>
-        </w:rPr>
-      </w:pPr>
-      <w:r>
-        <w:rPr>
-          <w:rFonts w:asciiTheme="majorHAnsi" w:eastAsia="Times New Roman" w:hAnsiTheme="majorHAnsi" w:cstheme="majorHAnsi"/>
-          <w:kern w:val="0"/>
-          <w:sz w:val="24"/>
-          <w:szCs w:val="24"/>
-          <w:lang w:eastAsia="vi-VN"/>
-          <w14:ligatures w14:val="none"/>
-        </w:rPr>
-        <w:t>Ví dụ:</w:t>
-      </w:r>
-    </w:p>
-    <w:p>
-      <w:pPr>
-        <w:pStyle w:val="NormalWeb"/>
-        <w:pBdr>
-          <w:top w:val="single" w:sz="6" w:space="2" w:color="888888"/>
-          <w:left w:val="single" w:sz="6" w:space="2" w:color="888888"/>
-          <w:bottom w:val="single" w:sz="6" w:space="2" w:color="888888"/>
-          <w:right w:val="single" w:sz="6" w:space="2" w:color="888888"/>
-        </w:pBdr>
-        <w:shd w:val="clear" w:color="auto" w:fill="2B2B2B"/>
-        <w:tabs>
-          <w:tab w:val="left" w:pos="916"/>
-          <w:tab w:val="left" w:pos="1832"/>
-          <w:tab w:val="left" w:pos="2748"/>
-          <w:tab w:val="left" w:pos="3664"/>
-          <w:tab w:val="left" w:pos="4580"/>
-          <w:tab w:val="left" w:pos="5496"/>
-          <w:tab w:val="left" w:pos="6412"/>
-          <w:tab w:val="left" w:pos="7328"/>
-          <w:tab w:val="left" w:pos="8244"/>
-          <w:tab w:val="left" w:pos="9160"/>
-          <w:tab w:val="left" w:pos="10076"/>
-          <w:tab w:val="left" w:pos="10992"/>
-          <w:tab w:val="left" w:pos="11908"/>
-          <w:tab w:val="left" w:pos="12824"/>
-          <w:tab w:val="left" w:pos="13740"/>
-          <w:tab w:val="left" w:pos="14656"/>
-        </w:tabs>
         <w:spacing w:after="0"/>
         <w:divId w:val="1578051808"/>
         <w:rPr>
-          <w:rFonts w:ascii="Consolas" w:hAnsi="Consolas" w:cs="Courier New"/>
+          <w:rFonts w:asciiTheme="majorHAnsi" w:hAnsiTheme="majorHAnsi" w:cstheme="majorHAnsi"/>
           <w:color w:val="F8F8F2"/>
           <w:kern w:val="0"/>
           <w:lang w:val="en-US"/>
@@ -2989,14 +2813,14 @@
       </w:pPr>
       <w:r>
         <w:rPr>
-          <w:rFonts w:ascii="Consolas" w:hAnsi="Consolas" w:cs="Courier New"/>
+          <w:rFonts w:asciiTheme="majorHAnsi" w:hAnsiTheme="majorHAnsi" w:cstheme="majorHAnsi"/>
           <w:color w:val="F8F8F2"/>
         </w:rPr>
         <w:t xml:space="preserve">git </w:t>
       </w:r>
       <w:r>
         <w:rPr>
-          <w:rFonts w:ascii="Consolas" w:hAnsi="Consolas" w:cs="Courier New"/>
+          <w:rFonts w:asciiTheme="majorHAnsi" w:hAnsiTheme="majorHAnsi" w:cstheme="majorHAnsi"/>
           <w:b/>
           <w:bCs/>
           <w:color w:val="DCC6E0"/>
@@ -3005,14 +2829,14 @@
       </w:r>
       <w:r>
         <w:rPr>
-          <w:rFonts w:ascii="Consolas" w:hAnsi="Consolas" w:cs="Courier New"/>
+          <w:rFonts w:asciiTheme="majorHAnsi" w:hAnsiTheme="majorHAnsi" w:cstheme="majorHAnsi"/>
           <w:color w:val="F8F8F2"/>
         </w:rPr>
         <w:t xml:space="preserve"> .</w:t>
       </w:r>
       <w:r>
         <w:rPr>
-          <w:rFonts w:ascii="Consolas" w:hAnsi="Consolas" w:cs="Courier New"/>
+          <w:rFonts w:asciiTheme="majorHAnsi" w:hAnsiTheme="majorHAnsi" w:cstheme="majorHAnsi"/>
           <w:color w:val="F8F8F2"/>
         </w:rPr>
         <w:br/>
@@ -3020,7 +2844,7 @@
       </w:r>
       <w:r>
         <w:rPr>
-          <w:rFonts w:ascii="Consolas" w:hAnsi="Consolas" w:cs="Courier New"/>
+          <w:rFonts w:asciiTheme="majorHAnsi" w:hAnsiTheme="majorHAnsi" w:cstheme="majorHAnsi"/>
           <w:color w:val="ABE338"/>
         </w:rPr>
         <w:t>"update login"</w:t>

</xml_diff>